<commit_message>
Add repo link, CI screenshots and student details to report
Co-Authored-By: Claude Opus 5.5 <noreply@anthropic.com>
</commit_message>
<xml_diff>
--- a/reports/MLOps_Assignment1_Report.docx
+++ b/reports/MLOps_Assignment1_Report.docx
@@ -76,7 +76,7 @@
           <w:i w:val="0"/>
           <w:sz w:val="24"/>
         </w:rPr>
-        <w:t>&lt;Student name&gt;  |  &lt;BITS ID&gt;</w:t>
+        <w:t>Altaf Anwar Pinjari  |  2025AE05638</w:t>
       </w:r>
     </w:p>
     <w:p>
@@ -94,7 +94,7 @@
         <w:rPr>
           <w:color w:val="1F6F8B"/>
         </w:rPr>
-        <w:t>https://github.com/&lt;your-username&gt;/heart-disease-mlops</w:t>
+        <w:t>https://github.com/altafpinjari2001/heart-disease-mlops</w:t>
       </w:r>
     </w:p>
     <w:p>
@@ -472,7 +472,7 @@
           <w:rFonts w:ascii="Consolas" w:hAnsi="Consolas"/>
           <w:sz w:val="17"/>
         </w:rPr>
-        <w:t>git clone &lt;repo-url&gt; &amp;&amp; cd heart-disease-mlops</w:t>
+        <w:t>git clone https://github.com/altafpinjari2001/heart-disease-mlops.git &amp;&amp; cd heart-disease-mlops</w:t>
       </w:r>
     </w:p>
     <w:p>
@@ -3351,38 +3351,45 @@
         <w:t>Jobs are chained with needs:, so any lint error, failing test, training crash, quality-gate miss or broken container stops the pipeline, and each failing step keeps its full log in the run.</w:t>
       </w:r>
     </w:p>
-    <w:tbl>
-      <w:tblPr>
-        <w:tblStyle w:val="TableGrid"/>
-        <w:tblW w:type="auto" w:w="0"/>
+    <w:p>
+      <w:pPr>
         <w:jc w:val="center"/>
-        <w:tblLook w:firstColumn="1" w:firstRow="1" w:lastColumn="0" w:lastRow="0" w:noHBand="0" w:noVBand="1" w:val="04A0"/>
-      </w:tblPr>
-      <w:tblGrid>
-        <w:gridCol w:w="9752"/>
-      </w:tblGrid>
-      <w:tr>
-        <w:tc>
-          <w:tcPr>
-            <w:tcW w:type="dxa" w:w="7937"/>
-          </w:tcPr>
-          <w:p>
-            <w:pPr>
-              <w:jc w:val="center"/>
-            </w:pPr>
-            <w:r>
-              <w:rPr>
-                <w:b/>
-                <w:color w:val="C0392B"/>
-              </w:rPr>
-              <w:br/>
-              <w:t>[ Insert screenshot: screenshots/07_github_actions_pipeline.png ]</w:t>
-              <w:br/>
-            </w:r>
-          </w:p>
-        </w:tc>
-      </w:tr>
-    </w:tbl>
+      </w:pPr>
+      <w:r>
+        <w:drawing>
+          <wp:inline xmlns:a="http://schemas.openxmlformats.org/drawingml/2006/main" xmlns:pic="http://schemas.openxmlformats.org/drawingml/2006/picture">
+            <wp:extent cx="5040000" cy="4368000"/>
+            <wp:docPr id="17" name="Picture 17"/>
+            <wp:cNvGraphicFramePr>
+              <a:graphicFrameLocks noChangeAspect="1"/>
+            </wp:cNvGraphicFramePr>
+            <a:graphic>
+              <a:graphicData uri="http://schemas.openxmlformats.org/drawingml/2006/picture">
+                <pic:pic>
+                  <pic:nvPicPr>
+                    <pic:cNvPr id="0" name="07_github_actions_pipeline.png"/>
+                    <pic:cNvPicPr/>
+                  </pic:nvPicPr>
+                  <pic:blipFill>
+                    <a:blip r:embed="rId25"/>
+                    <a:stretch>
+                      <a:fillRect/>
+                    </a:stretch>
+                  </pic:blipFill>
+                  <pic:spPr>
+                    <a:xfrm>
+                      <a:off x="0" y="0"/>
+                      <a:ext cx="5040000" cy="4368000"/>
+                    </a:xfrm>
+                    <a:prstGeom prst="rect"/>
+                  </pic:spPr>
+                </pic:pic>
+              </a:graphicData>
+            </a:graphic>
+          </wp:inline>
+        </w:drawing>
+      </w:r>
+    </w:p>
     <w:p>
       <w:pPr>
         <w:jc w:val="center"/>
@@ -3393,7 +3400,59 @@
           <w:color w:val="556670"/>
           <w:sz w:val="18"/>
         </w:rPr>
-        <w:t>Figure 13 - GitHub Actions run with all jobs and artefacts.</w:t>
+        <w:t>Figure 13 - GitHub Actions run #1: all four jobs green, 6 artefacts.</w:t>
+      </w:r>
+    </w:p>
+    <w:p>
+      <w:pPr>
+        <w:jc w:val="center"/>
+      </w:pPr>
+      <w:r>
+        <w:drawing>
+          <wp:inline xmlns:a="http://schemas.openxmlformats.org/drawingml/2006/main" xmlns:pic="http://schemas.openxmlformats.org/drawingml/2006/picture">
+            <wp:extent cx="5580000" cy="4836000"/>
+            <wp:docPr id="18" name="Picture 18"/>
+            <wp:cNvGraphicFramePr>
+              <a:graphicFrameLocks noChangeAspect="1"/>
+            </wp:cNvGraphicFramePr>
+            <a:graphic>
+              <a:graphicData uri="http://schemas.openxmlformats.org/drawingml/2006/picture">
+                <pic:pic>
+                  <pic:nvPicPr>
+                    <pic:cNvPr id="0" name="07b_github_actions_docker_job.png"/>
+                    <pic:cNvPicPr/>
+                  </pic:nvPicPr>
+                  <pic:blipFill>
+                    <a:blip r:embed="rId26"/>
+                    <a:stretch>
+                      <a:fillRect/>
+                    </a:stretch>
+                  </pic:blipFill>
+                  <pic:spPr>
+                    <a:xfrm>
+                      <a:off x="0" y="0"/>
+                      <a:ext cx="5580000" cy="4836000"/>
+                    </a:xfrm>
+                    <a:prstGeom prst="rect"/>
+                  </pic:spPr>
+                </pic:pic>
+              </a:graphicData>
+            </a:graphic>
+          </wp:inline>
+        </w:drawing>
+      </w:r>
+    </w:p>
+    <w:p>
+      <w:pPr>
+        <w:jc w:val="center"/>
+      </w:pPr>
+      <w:r>
+        <w:rPr>
+          <w:i/>
+          <w:color w:val="556670"/>
+          <w:sz w:val="18"/>
+        </w:rPr>
+        <w:t>Figure 13b - CI Docker job log: image build, container start, /health and /predict smoke test, structured container logs.</w:t>
       </w:r>
     </w:p>
     <w:p>
@@ -3529,7 +3588,7 @@
         <w:drawing>
           <wp:inline xmlns:a="http://schemas.openxmlformats.org/drawingml/2006/main" xmlns:pic="http://schemas.openxmlformats.org/drawingml/2006/picture">
             <wp:extent cx="5400000" cy="2160000"/>
-            <wp:docPr id="17" name="Picture 17"/>
+            <wp:docPr id="19" name="Picture 19"/>
             <wp:cNvGraphicFramePr>
               <a:graphicFrameLocks noChangeAspect="1"/>
             </wp:cNvGraphicFramePr>
@@ -3541,7 +3600,7 @@
                     <pic:cNvPicPr/>
                   </pic:nvPicPr>
                   <pic:blipFill>
-                    <a:blip r:embed="rId25"/>
+                    <a:blip r:embed="rId27"/>
                     <a:stretch>
                       <a:fillRect/>
                     </a:stretch>
@@ -4101,7 +4160,7 @@
         <w:drawing>
           <wp:inline xmlns:a="http://schemas.openxmlformats.org/drawingml/2006/main" xmlns:pic="http://schemas.openxmlformats.org/drawingml/2006/picture">
             <wp:extent cx="4860000" cy="2786400"/>
-            <wp:docPr id="18" name="Picture 18"/>
+            <wp:docPr id="20" name="Picture 20"/>
             <wp:cNvGraphicFramePr>
               <a:graphicFrameLocks noChangeAspect="1"/>
             </wp:cNvGraphicFramePr>
@@ -4113,7 +4172,7 @@
                     <pic:cNvPicPr/>
                   </pic:nvPicPr>
                   <pic:blipFill>
-                    <a:blip r:embed="rId26"/>
+                    <a:blip r:embed="rId28"/>
                     <a:stretch>
                       <a:fillRect/>
                     </a:stretch>
@@ -4153,7 +4212,7 @@
         <w:drawing>
           <wp:inline xmlns:a="http://schemas.openxmlformats.org/drawingml/2006/main" xmlns:pic="http://schemas.openxmlformats.org/drawingml/2006/picture">
             <wp:extent cx="5040000" cy="1881600"/>
-            <wp:docPr id="19" name="Picture 19"/>
+            <wp:docPr id="21" name="Picture 21"/>
             <wp:cNvGraphicFramePr>
               <a:graphicFrameLocks noChangeAspect="1"/>
             </wp:cNvGraphicFramePr>
@@ -4165,7 +4224,7 @@
                     <pic:cNvPicPr/>
                   </pic:nvPicPr>
                   <pic:blipFill>
-                    <a:blip r:embed="rId27"/>
+                    <a:blip r:embed="rId29"/>
                     <a:stretch>
                       <a:fillRect/>
                     </a:stretch>
@@ -4292,7 +4351,7 @@
         <w:rPr>
           <w:b/>
         </w:rPr>
-        <w:t>https://github.com/&lt;your-username&gt;/heart-disease-mlops</w:t>
+        <w:t>https://github.com/altafpinjari2001/heart-disease-mlops</w:t>
       </w:r>
     </w:p>
     <w:sectPr>

</xml_diff>

<commit_message>
Deploy to Docker Desktop Kubernetes: LoadBalancer, Ingress, HPA, Prometheus/Grafana; add deployment screenshots
- API LoadBalancer on 8080, NGINX ingress (NodePort + port-forward) on Docker Desktop
- deploy scripts handle Docker Desktop and Minikube, install ingress-nginx + metrics-server
- Grafana anonymous read-only viewing, 5xx panel shows 0 when no errors
- report updated with Docker, Kubernetes, Grafana and Prometheus evidence

Co-Authored-By: Claude Opus 5.5 <noreply@anthropic.com>
</commit_message>
<xml_diff>
--- a/reports/MLOps_Assignment1_Report.docx
+++ b/reports/MLOps_Assignment1_Report.docx
@@ -458,7 +458,7 @@
         <w:rPr>
           <w:i w:val="0"/>
         </w:rPr>
-        <w:t>Requirements: Python 3.11, Git; Docker and Minikube (or Docker Desktop Kubernetes) for the deployment steps. All library versions are pinned in requirements.txt; requirements-api.txt is the minimal runtime subset used by the container (same pins, so the pickled pipeline always loads).</w:t>
+        <w:t>Requirements: Python 3.11, Git; Docker Desktop with Kubernetes (or Minikube) for the deployment steps. All library versions are pinned in requirements.txt; requirements-api.txt is the minimal runtime subset used by the container (same pins, so the pickled pipeline always loads).</w:t>
       </w:r>
     </w:p>
     <w:p>
@@ -989,58 +989,6 @@
     </w:p>
     <w:p>
       <w:pPr>
-        <w:jc w:val="center"/>
-      </w:pPr>
-      <w:r>
-        <w:drawing>
-          <wp:inline xmlns:a="http://schemas.openxmlformats.org/drawingml/2006/main" xmlns:pic="http://schemas.openxmlformats.org/drawingml/2006/picture">
-            <wp:extent cx="5400000" cy="1370769"/>
-            <wp:docPr id="2" name="Picture 2"/>
-            <wp:cNvGraphicFramePr>
-              <a:graphicFrameLocks noChangeAspect="1"/>
-            </wp:cNvGraphicFramePr>
-            <a:graphic>
-              <a:graphicData uri="http://schemas.openxmlformats.org/drawingml/2006/picture">
-                <pic:pic>
-                  <pic:nvPicPr>
-                    <pic:cNvPr id="0" name="01_data_download.png"/>
-                    <pic:cNvPicPr/>
-                  </pic:nvPicPr>
-                  <pic:blipFill>
-                    <a:blip r:embed="rId10"/>
-                    <a:stretch>
-                      <a:fillRect/>
-                    </a:stretch>
-                  </pic:blipFill>
-                  <pic:spPr>
-                    <a:xfrm>
-                      <a:off x="0" y="0"/>
-                      <a:ext cx="5400000" cy="1370769"/>
-                    </a:xfrm>
-                    <a:prstGeom prst="rect"/>
-                  </pic:spPr>
-                </pic:pic>
-              </a:graphicData>
-            </a:graphic>
-          </wp:inline>
-        </w:drawing>
-      </w:r>
-    </w:p>
-    <w:p>
-      <w:pPr>
-        <w:jc w:val="center"/>
-      </w:pPr>
-      <w:r>
-        <w:rPr>
-          <w:i/>
-          <w:color w:val="556670"/>
-          <w:sz w:val="18"/>
-        </w:rPr>
-        <w:t>Figure 2 - Data acquisition script downloading and cleaning the data.</w:t>
-      </w:r>
-    </w:p>
-    <w:p>
-      <w:pPr>
         <w:pStyle w:val="Heading1"/>
       </w:pPr>
       <w:r>
@@ -1128,7 +1076,7 @@
               <w:drawing>
                 <wp:inline xmlns:a="http://schemas.openxmlformats.org/drawingml/2006/main" xmlns:pic="http://schemas.openxmlformats.org/drawingml/2006/picture">
                   <wp:extent cx="2592000" cy="2016000"/>
-                  <wp:docPr id="3" name="Picture 3"/>
+                  <wp:docPr id="2" name="Picture 2"/>
                   <wp:cNvGraphicFramePr>
                     <a:graphicFrameLocks noChangeAspect="1"/>
                   </wp:cNvGraphicFramePr>
@@ -1140,7 +1088,7 @@
                           <pic:cNvPicPr/>
                         </pic:nvPicPr>
                         <pic:blipFill>
-                          <a:blip r:embed="rId11"/>
+                          <a:blip r:embed="rId10"/>
                           <a:stretch>
                             <a:fillRect/>
                           </a:stretch>
@@ -1172,7 +1120,7 @@
               <w:drawing>
                 <wp:inline xmlns:a="http://schemas.openxmlformats.org/drawingml/2006/main" xmlns:pic="http://schemas.openxmlformats.org/drawingml/2006/picture">
                   <wp:extent cx="2592000" cy="1612800"/>
-                  <wp:docPr id="4" name="Picture 4"/>
+                  <wp:docPr id="3" name="Picture 3"/>
                   <wp:cNvGraphicFramePr>
                     <a:graphicFrameLocks noChangeAspect="1"/>
                   </wp:cNvGraphicFramePr>
@@ -1184,7 +1132,7 @@
                           <pic:cNvPicPr/>
                         </pic:nvPicPr>
                         <pic:blipFill>
-                          <a:blip r:embed="rId12"/>
+                          <a:blip r:embed="rId11"/>
                           <a:stretch>
                             <a:fillRect/>
                           </a:stretch>
@@ -1216,7 +1164,7 @@
           <w:color w:val="556670"/>
           <w:sz w:val="18"/>
         </w:rPr>
-        <w:t>Figure 3 - Class balance (164 healthy vs 139 diseased, 54 / 46 %) and missing values in the raw file.</w:t>
+        <w:t>Figure 2 - Class balance (164 healthy vs 139 diseased, 54 / 46 %) and missing values in the raw file.</w:t>
       </w:r>
     </w:p>
     <w:p>
@@ -1235,7 +1183,7 @@
         <w:drawing>
           <wp:inline xmlns:a="http://schemas.openxmlformats.org/drawingml/2006/main" xmlns:pic="http://schemas.openxmlformats.org/drawingml/2006/picture">
             <wp:extent cx="4860000" cy="2632500"/>
-            <wp:docPr id="5" name="Picture 5"/>
+            <wp:docPr id="4" name="Picture 4"/>
             <wp:cNvGraphicFramePr>
               <a:graphicFrameLocks noChangeAspect="1"/>
             </wp:cNvGraphicFramePr>
@@ -1247,7 +1195,7 @@
                     <pic:cNvPicPr/>
                   </pic:nvPicPr>
                   <pic:blipFill>
-                    <a:blip r:embed="rId13"/>
+                    <a:blip r:embed="rId12"/>
                     <a:stretch>
                       <a:fillRect/>
                     </a:stretch>
@@ -1276,7 +1224,7 @@
           <w:color w:val="556670"/>
           <w:sz w:val="18"/>
         </w:rPr>
-        <w:t>Figure 4 - Continuous features by diagnosis.</w:t>
+        <w:t>Figure 3 - Continuous features by diagnosis.</w:t>
       </w:r>
     </w:p>
     <w:p>
@@ -1326,7 +1274,7 @@
               <w:drawing>
                 <wp:inline xmlns:a="http://schemas.openxmlformats.org/drawingml/2006/main" xmlns:pic="http://schemas.openxmlformats.org/drawingml/2006/picture">
                   <wp:extent cx="2951999" cy="2459999"/>
-                  <wp:docPr id="6" name="Picture 6"/>
+                  <wp:docPr id="5" name="Picture 5"/>
                   <wp:cNvGraphicFramePr>
                     <a:graphicFrameLocks noChangeAspect="1"/>
                   </wp:cNvGraphicFramePr>
@@ -1338,7 +1286,7 @@
                           <pic:cNvPicPr/>
                         </pic:nvPicPr>
                         <pic:blipFill>
-                          <a:blip r:embed="rId14"/>
+                          <a:blip r:embed="rId13"/>
                           <a:stretch>
                             <a:fillRect/>
                           </a:stretch>
@@ -1370,7 +1318,7 @@
               <w:drawing>
                 <wp:inline xmlns:a="http://schemas.openxmlformats.org/drawingml/2006/main" xmlns:pic="http://schemas.openxmlformats.org/drawingml/2006/picture">
                   <wp:extent cx="2951999" cy="2043692"/>
-                  <wp:docPr id="7" name="Picture 7"/>
+                  <wp:docPr id="6" name="Picture 6"/>
                   <wp:cNvGraphicFramePr>
                     <a:graphicFrameLocks noChangeAspect="1"/>
                   </wp:cNvGraphicFramePr>
@@ -1382,7 +1330,7 @@
                           <pic:cNvPicPr/>
                         </pic:nvPicPr>
                         <pic:blipFill>
-                          <a:blip r:embed="rId15"/>
+                          <a:blip r:embed="rId14"/>
                           <a:stretch>
                             <a:fillRect/>
                           </a:stretch>
@@ -1414,7 +1362,7 @@
           <w:color w:val="556670"/>
           <w:sz w:val="18"/>
         </w:rPr>
-        <w:t>Figure 5 - Spearman correlation heatmap (left) and max heart rate vs age (right): most diseased patients fall below 85 % of the age-predicted maximum.</w:t>
+        <w:t>Figure 4 - Spearman correlation heatmap (left) and max heart rate vs age (right): most diseased patients fall below 85 % of the age-predicted maximum.</w:t>
       </w:r>
     </w:p>
     <w:p>
@@ -1425,7 +1373,7 @@
         <w:drawing>
           <wp:inline xmlns:a="http://schemas.openxmlformats.org/drawingml/2006/main" xmlns:pic="http://schemas.openxmlformats.org/drawingml/2006/picture">
             <wp:extent cx="5220000" cy="2423571"/>
-            <wp:docPr id="8" name="Picture 8"/>
+            <wp:docPr id="7" name="Picture 7"/>
             <wp:cNvGraphicFramePr>
               <a:graphicFrameLocks noChangeAspect="1"/>
             </wp:cNvGraphicFramePr>
@@ -1437,7 +1385,7 @@
                     <pic:cNvPicPr/>
                   </pic:nvPicPr>
                   <pic:blipFill>
-                    <a:blip r:embed="rId16"/>
+                    <a:blip r:embed="rId15"/>
                     <a:stretch>
                       <a:fillRect/>
                     </a:stretch>
@@ -1466,7 +1414,7 @@
           <w:color w:val="556670"/>
           <w:sz w:val="18"/>
         </w:rPr>
-        <w:t>Figure 6 - Disease rate per category (dashed line = overall rate).</w:t>
+        <w:t>Figure 5 - Disease rate per category (dashed line = overall rate).</w:t>
       </w:r>
     </w:p>
     <w:p>
@@ -1482,7 +1430,7 @@
         <w:rPr>
           <w:i w:val="0"/>
         </w:rPr>
-        <w:t>Figure 5 (right) motivates the engineered feature hr_reserve_ratio = thalach / (220 - age): the fraction of the age-predicted maximum heart rate reached during the stress test. It separates the age effect from the cardiac response. Box plots (reports/figures/eda/06_boxplots.png) show a few high-cholesterol outliers that are physiologically plausible and were therefore kept.</w:t>
+        <w:t>Figure 4 (right) motivates the engineered feature hr_reserve_ratio = thalach / (220 - age): the fraction of the age-predicted maximum heart rate reached during the stress test. It separates the age effect from the cardiac response. Box plots (reports/figures/eda/06_boxplots.png) show a few high-cholesterol outliers that are physiologically plausible and were therefore kept.</w:t>
       </w:r>
     </w:p>
     <w:p>
@@ -2337,7 +2285,7 @@
         <w:drawing>
           <wp:inline xmlns:a="http://schemas.openxmlformats.org/drawingml/2006/main" xmlns:pic="http://schemas.openxmlformats.org/drawingml/2006/picture">
             <wp:extent cx="3960000" cy="1980000"/>
-            <wp:docPr id="9" name="Picture 9"/>
+            <wp:docPr id="8" name="Picture 8"/>
             <wp:cNvGraphicFramePr>
               <a:graphicFrameLocks noChangeAspect="1"/>
             </wp:cNvGraphicFramePr>
@@ -2349,7 +2297,7 @@
                     <pic:cNvPicPr/>
                   </pic:nvPicPr>
                   <pic:blipFill>
-                    <a:blip r:embed="rId17"/>
+                    <a:blip r:embed="rId16"/>
                     <a:stretch>
                       <a:fillRect/>
                     </a:stretch>
@@ -2378,7 +2326,7 @@
           <w:color w:val="556670"/>
           <w:sz w:val="18"/>
         </w:rPr>
-        <w:t>Figure 7 - Cross-validated metrics of the tuned model families.</w:t>
+        <w:t>Figure 6 - Cross-validated metrics of the tuned model families.</w:t>
       </w:r>
     </w:p>
     <w:p>
@@ -2412,7 +2360,7 @@
               <w:drawing>
                 <wp:inline xmlns:a="http://schemas.openxmlformats.org/drawingml/2006/main" xmlns:pic="http://schemas.openxmlformats.org/drawingml/2006/picture">
                   <wp:extent cx="2448000" cy="2214857"/>
-                  <wp:docPr id="10" name="Picture 10"/>
+                  <wp:docPr id="9" name="Picture 9"/>
                   <wp:cNvGraphicFramePr>
                     <a:graphicFrameLocks noChangeAspect="1"/>
                   </wp:cNvGraphicFramePr>
@@ -2424,7 +2372,7 @@
                           <pic:cNvPicPr/>
                         </pic:nvPicPr>
                         <pic:blipFill>
-                          <a:blip r:embed="rId18"/>
+                          <a:blip r:embed="rId17"/>
                           <a:stretch>
                             <a:fillRect/>
                           </a:stretch>
@@ -2456,7 +2404,7 @@
               <w:drawing>
                 <wp:inline xmlns:a="http://schemas.openxmlformats.org/drawingml/2006/main" xmlns:pic="http://schemas.openxmlformats.org/drawingml/2006/picture">
                   <wp:extent cx="2448000" cy="2366400"/>
-                  <wp:docPr id="11" name="Picture 11"/>
+                  <wp:docPr id="10" name="Picture 10"/>
                   <wp:cNvGraphicFramePr>
                     <a:graphicFrameLocks noChangeAspect="1"/>
                   </wp:cNvGraphicFramePr>
@@ -2468,7 +2416,7 @@
                           <pic:cNvPicPr/>
                         </pic:nvPicPr>
                         <pic:blipFill>
-                          <a:blip r:embed="rId19"/>
+                          <a:blip r:embed="rId18"/>
                           <a:stretch>
                             <a:fillRect/>
                           </a:stretch>
@@ -2500,7 +2448,7 @@
           <w:color w:val="556670"/>
           <w:sz w:val="18"/>
         </w:rPr>
-        <w:t>Figure 8 - Champion confusion matrix on the test split (left) and coefficients on standardised features (right).</w:t>
+        <w:t>Figure 7 - Champion confusion matrix on the test split (left) and coefficients on standardised features (right).</w:t>
       </w:r>
     </w:p>
     <w:p>
@@ -2584,7 +2532,7 @@
               <w:drawing>
                 <wp:inline xmlns:a="http://schemas.openxmlformats.org/drawingml/2006/main" xmlns:pic="http://schemas.openxmlformats.org/drawingml/2006/picture">
                   <wp:extent cx="2951999" cy="1660499"/>
-                  <wp:docPr id="12" name="Picture 12"/>
+                  <wp:docPr id="11" name="Picture 11"/>
                   <wp:cNvGraphicFramePr>
                     <a:graphicFrameLocks noChangeAspect="1"/>
                   </wp:cNvGraphicFramePr>
@@ -2596,7 +2544,7 @@
                           <pic:cNvPicPr/>
                         </pic:nvPicPr>
                         <pic:blipFill>
-                          <a:blip r:embed="rId20"/>
+                          <a:blip r:embed="rId19"/>
                           <a:stretch>
                             <a:fillRect/>
                           </a:stretch>
@@ -2628,7 +2576,7 @@
               <w:drawing>
                 <wp:inline xmlns:a="http://schemas.openxmlformats.org/drawingml/2006/main" xmlns:pic="http://schemas.openxmlformats.org/drawingml/2006/picture">
                   <wp:extent cx="2951999" cy="2306249"/>
-                  <wp:docPr id="13" name="Picture 13"/>
+                  <wp:docPr id="12" name="Picture 12"/>
                   <wp:cNvGraphicFramePr>
                     <a:graphicFrameLocks noChangeAspect="1"/>
                   </wp:cNvGraphicFramePr>
@@ -2640,7 +2588,7 @@
                           <pic:cNvPicPr/>
                         </pic:nvPicPr>
                         <pic:blipFill>
-                          <a:blip r:embed="rId21"/>
+                          <a:blip r:embed="rId20"/>
                           <a:stretch>
                             <a:fillRect/>
                           </a:stretch>
@@ -2672,7 +2620,7 @@
           <w:color w:val="556670"/>
           <w:sz w:val="18"/>
         </w:rPr>
-        <w:t>Figure 9 - MLflow experiment 'heart-disease-risk' (left) and the champion run with parameters and metrics (right).</w:t>
+        <w:t>Figure 8 - MLflow experiment 'heart-disease-risk' (left) and the champion run with parameters and metrics (right).</w:t>
       </w:r>
     </w:p>
     <w:p>
@@ -2683,7 +2631,7 @@
         <w:drawing>
           <wp:inline xmlns:a="http://schemas.openxmlformats.org/drawingml/2006/main" xmlns:pic="http://schemas.openxmlformats.org/drawingml/2006/picture">
             <wp:extent cx="5220000" cy="1898182"/>
-            <wp:docPr id="14" name="Picture 14"/>
+            <wp:docPr id="13" name="Picture 13"/>
             <wp:cNvGraphicFramePr>
               <a:graphicFrameLocks noChangeAspect="1"/>
             </wp:cNvGraphicFramePr>
@@ -2695,7 +2643,7 @@
                     <pic:cNvPicPr/>
                   </pic:nvPicPr>
                   <pic:blipFill>
-                    <a:blip r:embed="rId22"/>
+                    <a:blip r:embed="rId21"/>
                     <a:stretch>
                       <a:fillRect/>
                     </a:stretch>
@@ -2724,7 +2672,7 @@
           <w:color w:val="556670"/>
           <w:sz w:val="18"/>
         </w:rPr>
-        <w:t>Figure 10 - All 64 tuning runs read back from MLflow (scripts/experiment_summary.py).</w:t>
+        <w:t>Figure 9 - All 64 tuning runs read back from MLflow (scripts/experiment_summary.py).</w:t>
       </w:r>
     </w:p>
     <w:p>
@@ -2743,7 +2691,7 @@
         <w:drawing>
           <wp:inline xmlns:a="http://schemas.openxmlformats.org/drawingml/2006/main" xmlns:pic="http://schemas.openxmlformats.org/drawingml/2006/picture">
             <wp:extent cx="3600000" cy="2025000"/>
-            <wp:docPr id="15" name="Picture 15"/>
+            <wp:docPr id="14" name="Picture 14"/>
             <wp:cNvGraphicFramePr>
               <a:graphicFrameLocks noChangeAspect="1"/>
             </wp:cNvGraphicFramePr>
@@ -2755,7 +2703,7 @@
                     <pic:cNvPicPr/>
                   </pic:nvPicPr>
                   <pic:blipFill>
-                    <a:blip r:embed="rId23"/>
+                    <a:blip r:embed="rId22"/>
                     <a:stretch>
                       <a:fillRect/>
                     </a:stretch>
@@ -2784,7 +2732,7 @@
           <w:color w:val="556670"/>
           <w:sz w:val="18"/>
         </w:rPr>
-        <w:t>Figure 11 - Logged artefacts of a run (plots, cv results, model).</w:t>
+        <w:t>Figure 10 - Logged artefacts of a run (plots, cv results, model).</w:t>
       </w:r>
     </w:p>
     <w:p>
@@ -3050,7 +2998,7 @@
         <w:drawing>
           <wp:inline xmlns:a="http://schemas.openxmlformats.org/drawingml/2006/main" xmlns:pic="http://schemas.openxmlformats.org/drawingml/2006/picture">
             <wp:extent cx="3780000" cy="3634615"/>
-            <wp:docPr id="16" name="Picture 16"/>
+            <wp:docPr id="15" name="Picture 15"/>
             <wp:cNvGraphicFramePr>
               <a:graphicFrameLocks noChangeAspect="1"/>
             </wp:cNvGraphicFramePr>
@@ -3062,7 +3010,7 @@
                     <pic:cNvPicPr/>
                   </pic:nvPicPr>
                   <pic:blipFill>
-                    <a:blip r:embed="rId24"/>
+                    <a:blip r:embed="rId23"/>
                     <a:stretch>
                       <a:fillRect/>
                     </a:stretch>
@@ -3091,7 +3039,7 @@
           <w:color w:val="556670"/>
           <w:sz w:val="18"/>
         </w:rPr>
-        <w:t>Figure 12 -flake8 (0 issues) and 28 passing tests with coverage.</w:t>
+        <w:t>Figure 11 -flake8 (0 issues) and 28 passing tests with coverage.</w:t>
       </w:r>
     </w:p>
     <w:p>
@@ -3358,8 +3306,8 @@
       <w:r>
         <w:drawing>
           <wp:inline xmlns:a="http://schemas.openxmlformats.org/drawingml/2006/main" xmlns:pic="http://schemas.openxmlformats.org/drawingml/2006/picture">
-            <wp:extent cx="5040000" cy="4368000"/>
-            <wp:docPr id="17" name="Picture 17"/>
+            <wp:extent cx="4140000" cy="3588000"/>
+            <wp:docPr id="16" name="Picture 16"/>
             <wp:cNvGraphicFramePr>
               <a:graphicFrameLocks noChangeAspect="1"/>
             </wp:cNvGraphicFramePr>
@@ -3371,7 +3319,7 @@
                     <pic:cNvPicPr/>
                   </pic:nvPicPr>
                   <pic:blipFill>
-                    <a:blip r:embed="rId25"/>
+                    <a:blip r:embed="rId24"/>
                     <a:stretch>
                       <a:fillRect/>
                     </a:stretch>
@@ -3379,7 +3327,7 @@
                   <pic:spPr>
                     <a:xfrm>
                       <a:off x="0" y="0"/>
-                      <a:ext cx="5040000" cy="4368000"/>
+                      <a:ext cx="4140000" cy="3588000"/>
                     </a:xfrm>
                     <a:prstGeom prst="rect"/>
                   </pic:spPr>
@@ -3400,7 +3348,7 @@
           <w:color w:val="556670"/>
           <w:sz w:val="18"/>
         </w:rPr>
-        <w:t>Figure 13 - GitHub Actions run #1: all four jobs green, 6 artefacts.</w:t>
+        <w:t>Figure 12 - GitHub Actions run #1: all four jobs green, 6 artefacts.</w:t>
       </w:r>
     </w:p>
     <w:p>
@@ -3410,8 +3358,8 @@
       <w:r>
         <w:drawing>
           <wp:inline xmlns:a="http://schemas.openxmlformats.org/drawingml/2006/main" xmlns:pic="http://schemas.openxmlformats.org/drawingml/2006/picture">
-            <wp:extent cx="5580000" cy="4836000"/>
-            <wp:docPr id="18" name="Picture 18"/>
+            <wp:extent cx="5040000" cy="2318400"/>
+            <wp:docPr id="17" name="Picture 17"/>
             <wp:cNvGraphicFramePr>
               <a:graphicFrameLocks noChangeAspect="1"/>
             </wp:cNvGraphicFramePr>
@@ -3423,7 +3371,7 @@
                     <pic:cNvPicPr/>
                   </pic:nvPicPr>
                   <pic:blipFill>
-                    <a:blip r:embed="rId26"/>
+                    <a:blip r:embed="rId25"/>
                     <a:stretch>
                       <a:fillRect/>
                     </a:stretch>
@@ -3431,7 +3379,7 @@
                   <pic:spPr>
                     <a:xfrm>
                       <a:off x="0" y="0"/>
-                      <a:ext cx="5580000" cy="4836000"/>
+                      <a:ext cx="5040000" cy="2318400"/>
                     </a:xfrm>
                     <a:prstGeom prst="rect"/>
                   </pic:spPr>
@@ -3452,7 +3400,7 @@
           <w:color w:val="556670"/>
           <w:sz w:val="18"/>
         </w:rPr>
-        <w:t>Figure 13b - CI Docker job log: image build, container start, /health and /predict smoke test, structured container logs.</w:t>
+        <w:t>Figure 13 - CI Docker job log: image build, container start, /health and /predict smoke test, structured container logs.</w:t>
       </w:r>
     </w:p>
     <w:p>
@@ -3506,79 +3454,12 @@
       </w:r>
     </w:p>
     <w:p>
-      <w:pPr>
-        <w:spacing w:after="0"/>
-        <w:ind w:left="227"/>
-        <w:shd w:val="clear" w:fill="F1F4F6"/>
-      </w:pPr>
       <w:r>
         <w:rPr>
-          <w:rFonts w:ascii="Consolas" w:hAnsi="Consolas"/>
-          <w:sz w:val="17"/>
+          <w:i w:val="0"/>
         </w:rPr>
-        <w:t>docker build -t heart-risk-api:1.0.0 .</w:t>
+        <w:t>The image was built and run locally with Docker Desktop 29.9 (final image 258 MB) and is also built and smoke-tested in every CI run (Figure 13).</w:t>
       </w:r>
-    </w:p>
-    <w:p>
-      <w:pPr>
-        <w:spacing w:after="0"/>
-        <w:ind w:left="227"/>
-        <w:shd w:val="clear" w:fill="F1F4F6"/>
-      </w:pPr>
-      <w:r>
-        <w:rPr>
-          <w:rFonts w:ascii="Consolas" w:hAnsi="Consolas"/>
-          <w:sz w:val="17"/>
-        </w:rPr>
-        <w:t>docker run -d --name heart-api -p 8000:8000 heart-risk-api:1.0.0</w:t>
-      </w:r>
-    </w:p>
-    <w:p>
-      <w:pPr>
-        <w:spacing w:after="0"/>
-        <w:ind w:left="227"/>
-        <w:shd w:val="clear" w:fill="F1F4F6"/>
-      </w:pPr>
-      <w:r>
-        <w:rPr>
-          <w:rFonts w:ascii="Consolas" w:hAnsi="Consolas"/>
-          <w:sz w:val="17"/>
-        </w:rPr>
-        <w:t>curl -X POST http://localhost:8000/predict -H "Content-Type: application/json" -d @sample_request.json</w:t>
-      </w:r>
-    </w:p>
-    <w:p>
-      <w:pPr>
-        <w:spacing w:after="0"/>
-        <w:ind w:left="227"/>
-        <w:shd w:val="clear" w:fill="F1F4F6"/>
-      </w:pPr>
-      <w:r>
-        <w:rPr>
-          <w:rFonts w:ascii="Consolas" w:hAnsi="Consolas"/>
-          <w:sz w:val="17"/>
-        </w:rPr>
-        <w:t>{"prediction":1,"label":"heart_disease","confidence":0.9767,"risk_probability":0.9767,</w:t>
-      </w:r>
-    </w:p>
-    <w:p>
-      <w:pPr>
-        <w:spacing w:after="0"/>
-        <w:ind w:left="227"/>
-        <w:shd w:val="clear" w:fill="F1F4F6"/>
-      </w:pPr>
-      <w:r>
-        <w:rPr>
-          <w:rFonts w:ascii="Consolas" w:hAnsi="Consolas"/>
-          <w:sz w:val="17"/>
-        </w:rPr>
-        <w:t xml:space="preserve"> "model_version":"1.0.0","request_id":"adccdac868c6"}</w:t>
-      </w:r>
-    </w:p>
-    <w:p>
-      <w:pPr>
-        <w:spacing w:after="40"/>
-      </w:pPr>
     </w:p>
     <w:p>
       <w:pPr>
@@ -3587,8 +3468,8 @@
       <w:r>
         <w:drawing>
           <wp:inline xmlns:a="http://schemas.openxmlformats.org/drawingml/2006/main" xmlns:pic="http://schemas.openxmlformats.org/drawingml/2006/picture">
-            <wp:extent cx="5400000" cy="2160000"/>
-            <wp:docPr id="19" name="Picture 19"/>
+            <wp:extent cx="3780000" cy="3053077"/>
+            <wp:docPr id="18" name="Picture 18"/>
             <wp:cNvGraphicFramePr>
               <a:graphicFrameLocks noChangeAspect="1"/>
             </wp:cNvGraphicFramePr>
@@ -3596,11 +3477,11 @@
               <a:graphicData uri="http://schemas.openxmlformats.org/drawingml/2006/picture">
                 <pic:pic>
                   <pic:nvPicPr>
-                    <pic:cNvPr id="0" name="09_api_predict_curl.png"/>
+                    <pic:cNvPr id="0" name="14_docker_build.png"/>
                     <pic:cNvPicPr/>
                   </pic:nvPicPr>
                   <pic:blipFill>
-                    <a:blip r:embed="rId27"/>
+                    <a:blip r:embed="rId26"/>
                     <a:stretch>
                       <a:fillRect/>
                     </a:stretch>
@@ -3608,7 +3489,7 @@
                   <pic:spPr>
                     <a:xfrm>
                       <a:off x="0" y="0"/>
-                      <a:ext cx="5400000" cy="2160000"/>
+                      <a:ext cx="3780000" cy="3053077"/>
                     </a:xfrm>
                     <a:prstGeom prst="rect"/>
                   </pic:spPr>
@@ -3629,64 +3510,48 @@
           <w:color w:val="556670"/>
           <w:sz w:val="18"/>
         </w:rPr>
-        <w:t>Figure 14 - Health check, predictions for a high- and a low-risk patient, validation error (422) and model info.</w:t>
+        <w:t>Figure 14 - Local multi-stage docker build of heart-risk-api:1.0.0.</w:t>
       </w:r>
     </w:p>
-    <w:tbl>
-      <w:tblPr>
-        <w:tblW w:type="auto" w:w="0"/>
+    <w:p>
+      <w:pPr>
         <w:jc w:val="center"/>
-        <w:tblLook w:firstColumn="1" w:firstRow="1" w:lastColumn="0" w:lastRow="0" w:noHBand="0" w:noVBand="1" w:val="04A0"/>
-      </w:tblPr>
-      <w:tblGrid>
-        <w:gridCol w:w="4876"/>
-        <w:gridCol w:w="4876"/>
-      </w:tblGrid>
-      <w:tr>
-        <w:tc>
-          <w:tcPr>
-            <w:tcW w:type="dxa" w:w="4762"/>
-          </w:tcPr>
-          <w:p>
-            <w:pPr>
-              <w:jc w:val="center"/>
-            </w:pPr>
-            <w:r>
-              <w:rPr>
-                <w:b/>
-                <w:color w:val="C0392B"/>
-              </w:rPr>
-              <w:br/>
-              <w:t>[ Insert screenshot:</w:t>
-              <w:br/>
-              <w:t>screenshots/14_docker_build.png ]</w:t>
-              <w:br/>
-            </w:r>
-          </w:p>
-        </w:tc>
-        <w:tc>
-          <w:tcPr>
-            <w:tcW w:type="dxa" w:w="4762"/>
-          </w:tcPr>
-          <w:p>
-            <w:pPr>
-              <w:jc w:val="center"/>
-            </w:pPr>
-            <w:r>
-              <w:rPr>
-                <w:b/>
-                <w:color w:val="C0392B"/>
-              </w:rPr>
-              <w:br/>
-              <w:t>[ Insert screenshot:</w:t>
-              <w:br/>
-              <w:t>screenshots/15_docker_run_predict.png ]</w:t>
-              <w:br/>
-            </w:r>
-          </w:p>
-        </w:tc>
-      </w:tr>
-    </w:tbl>
+      </w:pPr>
+      <w:r>
+        <w:drawing>
+          <wp:inline xmlns:a="http://schemas.openxmlformats.org/drawingml/2006/main" xmlns:pic="http://schemas.openxmlformats.org/drawingml/2006/picture">
+            <wp:extent cx="5400000" cy="1851429"/>
+            <wp:docPr id="19" name="Picture 19"/>
+            <wp:cNvGraphicFramePr>
+              <a:graphicFrameLocks noChangeAspect="1"/>
+            </wp:cNvGraphicFramePr>
+            <a:graphic>
+              <a:graphicData uri="http://schemas.openxmlformats.org/drawingml/2006/picture">
+                <pic:pic>
+                  <pic:nvPicPr>
+                    <pic:cNvPr id="0" name="15_docker_run_predict.png"/>
+                    <pic:cNvPicPr/>
+                  </pic:nvPicPr>
+                  <pic:blipFill>
+                    <a:blip r:embed="rId27"/>
+                    <a:stretch>
+                      <a:fillRect/>
+                    </a:stretch>
+                  </pic:blipFill>
+                  <pic:spPr>
+                    <a:xfrm>
+                      <a:off x="0" y="0"/>
+                      <a:ext cx="5400000" cy="1851429"/>
+                    </a:xfrm>
+                    <a:prstGeom prst="rect"/>
+                  </pic:spPr>
+                </pic:pic>
+              </a:graphicData>
+            </a:graphic>
+          </wp:inline>
+        </w:drawing>
+      </w:r>
+    </w:p>
     <w:p>
       <w:pPr>
         <w:jc w:val="center"/>
@@ -3697,7 +3562,7 @@
           <w:color w:val="556670"/>
           <w:sz w:val="18"/>
         </w:rPr>
-        <w:t>Figure 15 - Docker image build (left) and the container answering /predict (right).</w:t>
+        <w:t>Figure 15 - Container running (docker ps), /health and /predict answered from the container, JSON logs via docker logs.</w:t>
       </w:r>
     </w:p>
     <w:p>
@@ -3836,7 +3701,7 @@
               <w:rPr>
                 <w:sz w:val="18"/>
               </w:rPr>
-              <w:t>type LoadBalancer, port 80 -&gt; 8000</w:t>
+              <w:t>type LoadBalancer, port 8080 -&gt; 8000</w:t>
             </w:r>
           </w:p>
         </w:tc>
@@ -3866,7 +3731,7 @@
               <w:rPr>
                 <w:sz w:val="18"/>
               </w:rPr>
-              <w:t>nginx Ingress, host heart-risk.local</w:t>
+              <w:t>NGINX Ingress, host heart-risk.local</w:t>
             </w:r>
           </w:p>
         </w:tc>
@@ -3896,7 +3761,7 @@
               <w:rPr>
                 <w:sz w:val="18"/>
               </w:rPr>
-              <w:t>autoscale 2-5 replicas at 70 % CPU</w:t>
+              <w:t>autoscale 2-5 replicas at 70 % CPU (metrics-server)</w:t>
             </w:r>
           </w:p>
         </w:tc>
@@ -3938,17 +3803,11 @@
       </w:pPr>
     </w:p>
     <w:p>
-      <w:pPr>
-        <w:spacing w:after="0"/>
-        <w:ind w:left="227"/>
-        <w:shd w:val="clear" w:fill="F1F4F6"/>
-      </w:pPr>
       <w:r>
         <w:rPr>
-          <w:rFonts w:ascii="Consolas" w:hAnsi="Consolas"/>
-          <w:sz w:val="17"/>
+          <w:i w:val="0"/>
         </w:rPr>
-        <w:t>minikube start</w:t>
+        <w:t>The stack was deployed to Docker Desktop's built-in Kubernetes (single node, v1.36.1) with one script that builds the image, installs the NGINX ingress controller and metrics-server, and applies every manifest plus the monitoring stack:</w:t>
       </w:r>
     </w:p>
     <w:p>
@@ -3962,7 +3821,7 @@
           <w:rFonts w:ascii="Consolas" w:hAnsi="Consolas"/>
           <w:sz w:val="17"/>
         </w:rPr>
-        <w:t>bash scripts/deploy_k8s.sh        # build, load image, apply manifests + monitoring</w:t>
+        <w:t>bash scripts/deploy_k8s.sh        # Windows: scripts\deploy_k8s.ps1 (also supports Minikube)</w:t>
       </w:r>
     </w:p>
     <w:p>
@@ -3976,7 +3835,7 @@
           <w:rFonts w:ascii="Consolas" w:hAnsi="Consolas"/>
           <w:sz w:val="17"/>
         </w:rPr>
-        <w:t>minikube tunnel                   # separate terminal</w:t>
+        <w:t>kubectl -n heart-risk get deploy,pods,svc,ingress,hpa</w:t>
       </w:r>
     </w:p>
     <w:p>
@@ -3990,7 +3849,7 @@
           <w:rFonts w:ascii="Consolas" w:hAnsi="Consolas"/>
           <w:sz w:val="17"/>
         </w:rPr>
-        <w:t>kubectl -n heart-risk get pods,svc,ingress,hpa</w:t>
+        <w:t>curl -X POST http://localhost:8080/predict -H "Content-Type: application/json" -d @sample_request.json</w:t>
       </w:r>
     </w:p>
     <w:p>
@@ -4004,7 +3863,21 @@
           <w:rFonts w:ascii="Consolas" w:hAnsi="Consolas"/>
           <w:sz w:val="17"/>
         </w:rPr>
-        <w:t>curl -X POST http://&lt;EXTERNAL-IP&gt;/predict -H "Content-Type: application/json" -d @sample_request.json</w:t>
+        <w:t>kubectl -n ingress-nginx port-forward svc/ingress-nginx-controller 8088:80</w:t>
+      </w:r>
+    </w:p>
+    <w:p>
+      <w:pPr>
+        <w:spacing w:after="0"/>
+        <w:ind w:left="227"/>
+        <w:shd w:val="clear" w:fill="F1F4F6"/>
+      </w:pPr>
+      <w:r>
+        <w:rPr>
+          <w:rFonts w:ascii="Consolas" w:hAnsi="Consolas"/>
+          <w:sz w:val="17"/>
+        </w:rPr>
+        <w:t>curl -H "Host: heart-risk.local" http://localhost:8088/predict ...</w:t>
       </w:r>
     </w:p>
     <w:p>
@@ -4017,64 +3890,48 @@
         <w:rPr>
           <w:i w:val="0"/>
         </w:rPr>
-        <w:t>Access instructions: the API is deployed on a local Minikube cluster. With minikube tunnel running it is reachable at http://&lt;EXTERNAL-IP&gt;/ (LoadBalancer) or http://heart-risk.local/ after adding the Minikube IP to the hosts file (Ingress). Docker Desktop Kubernetes publishes the LoadBalancer on http://localhost/.</w:t>
+        <w:t>Access instructions (local cluster, no public URL): the LoadBalancer publishes the API on http://localhost:8080. Docker Desktop's load balancer serves a single LoadBalancer service, so the ingress controller runs as NodePort and is reached through a port-forward on localhost:8088 with the Host header heart-risk.local; a request without the host returns 404, proving host-based routing. On Minikube the same script works with minikube tunnel. Under the load test the HPA scaled the API from 2 to 4 replicas, and Prometheus discovered every new pod.</w:t>
       </w:r>
     </w:p>
-    <w:tbl>
-      <w:tblPr>
-        <w:tblW w:type="auto" w:w="0"/>
+    <w:p>
+      <w:pPr>
         <w:jc w:val="center"/>
-        <w:tblLook w:firstColumn="1" w:firstRow="1" w:lastColumn="0" w:lastRow="0" w:noHBand="0" w:noVBand="1" w:val="04A0"/>
-      </w:tblPr>
-      <w:tblGrid>
-        <w:gridCol w:w="4876"/>
-        <w:gridCol w:w="4876"/>
-      </w:tblGrid>
-      <w:tr>
-        <w:tc>
-          <w:tcPr>
-            <w:tcW w:type="dxa" w:w="4762"/>
-          </w:tcPr>
-          <w:p>
-            <w:pPr>
-              <w:jc w:val="center"/>
-            </w:pPr>
-            <w:r>
-              <w:rPr>
-                <w:b/>
-                <w:color w:val="C0392B"/>
-              </w:rPr>
-              <w:br/>
-              <w:t>[ Insert screenshot:</w:t>
-              <w:br/>
-              <w:t>screenshots/16_k8s_resources.png ]</w:t>
-              <w:br/>
-            </w:r>
-          </w:p>
-        </w:tc>
-        <w:tc>
-          <w:tcPr>
-            <w:tcW w:type="dxa" w:w="4762"/>
-          </w:tcPr>
-          <w:p>
-            <w:pPr>
-              <w:jc w:val="center"/>
-            </w:pPr>
-            <w:r>
-              <w:rPr>
-                <w:b/>
-                <w:color w:val="C0392B"/>
-              </w:rPr>
-              <w:br/>
-              <w:t>[ Insert screenshot:</w:t>
-              <w:br/>
-              <w:t>screenshots/17_k8s_predict_loadbalancer.png ]</w:t>
-              <w:br/>
-            </w:r>
-          </w:p>
-        </w:tc>
-      </w:tr>
-    </w:tbl>
+      </w:pPr>
+      <w:r>
+        <w:drawing>
+          <wp:inline xmlns:a="http://schemas.openxmlformats.org/drawingml/2006/main" xmlns:pic="http://schemas.openxmlformats.org/drawingml/2006/picture">
+            <wp:extent cx="5040000" cy="3179077"/>
+            <wp:docPr id="20" name="Picture 20"/>
+            <wp:cNvGraphicFramePr>
+              <a:graphicFrameLocks noChangeAspect="1"/>
+            </wp:cNvGraphicFramePr>
+            <a:graphic>
+              <a:graphicData uri="http://schemas.openxmlformats.org/drawingml/2006/picture">
+                <pic:pic>
+                  <pic:nvPicPr>
+                    <pic:cNvPr id="0" name="16_k8s_resources.png"/>
+                    <pic:cNvPicPr/>
+                  </pic:nvPicPr>
+                  <pic:blipFill>
+                    <a:blip r:embed="rId28"/>
+                    <a:stretch>
+                      <a:fillRect/>
+                    </a:stretch>
+                  </pic:blipFill>
+                  <pic:spPr>
+                    <a:xfrm>
+                      <a:off x="0" y="0"/>
+                      <a:ext cx="5040000" cy="3179077"/>
+                    </a:xfrm>
+                    <a:prstGeom prst="rect"/>
+                  </pic:spPr>
+                </pic:pic>
+              </a:graphicData>
+            </a:graphic>
+          </wp:inline>
+        </w:drawing>
+      </w:r>
+    </w:p>
     <w:p>
       <w:pPr>
         <w:jc w:val="center"/>
@@ -4085,7 +3942,59 @@
           <w:color w:val="556670"/>
           <w:sz w:val="18"/>
         </w:rPr>
-        <w:t>Figure 16 - Pods, Service, Ingress and HPA in namespace heart-risk (left) and a prediction served through the LoadBalancer (right).</w:t>
+        <w:t>Figure 16 - Node, Deployments, Pods, Services, Ingress and HPA (scaled 2 -&gt; 4 under load) in namespace heart-risk.</w:t>
+      </w:r>
+    </w:p>
+    <w:p>
+      <w:pPr>
+        <w:jc w:val="center"/>
+      </w:pPr>
+      <w:r>
+        <w:drawing>
+          <wp:inline xmlns:a="http://schemas.openxmlformats.org/drawingml/2006/main" xmlns:pic="http://schemas.openxmlformats.org/drawingml/2006/picture">
+            <wp:extent cx="5400000" cy="2005714"/>
+            <wp:docPr id="21" name="Picture 21"/>
+            <wp:cNvGraphicFramePr>
+              <a:graphicFrameLocks noChangeAspect="1"/>
+            </wp:cNvGraphicFramePr>
+            <a:graphic>
+              <a:graphicData uri="http://schemas.openxmlformats.org/drawingml/2006/picture">
+                <pic:pic>
+                  <pic:nvPicPr>
+                    <pic:cNvPr id="0" name="17_k8s_predict_loadbalancer.png"/>
+                    <pic:cNvPicPr/>
+                  </pic:nvPicPr>
+                  <pic:blipFill>
+                    <a:blip r:embed="rId29"/>
+                    <a:stretch>
+                      <a:fillRect/>
+                    </a:stretch>
+                  </pic:blipFill>
+                  <pic:spPr>
+                    <a:xfrm>
+                      <a:off x="0" y="0"/>
+                      <a:ext cx="5400000" cy="2005714"/>
+                    </a:xfrm>
+                    <a:prstGeom prst="rect"/>
+                  </pic:spPr>
+                </pic:pic>
+              </a:graphicData>
+            </a:graphic>
+          </wp:inline>
+        </w:drawing>
+      </w:r>
+    </w:p>
+    <w:p>
+      <w:pPr>
+        <w:jc w:val="center"/>
+      </w:pPr>
+      <w:r>
+        <w:rPr>
+          <w:i/>
+          <w:color w:val="556670"/>
+          <w:sz w:val="18"/>
+        </w:rPr>
+        <w:t>Figure 17 - Predictions served through the LoadBalancer and the NGINX Ingress, plus pod logs.</w:t>
       </w:r>
     </w:p>
     <w:p>
@@ -4149,7 +4058,7 @@
         <w:t xml:space="preserve">Dashboards: </w:t>
       </w:r>
       <w:r>
-        <w:t>Grafana dashboard (status, totals, positive share, error rate, latency percentiles, request rate, predictions per label, risk distribution) and a dependency-free /monitor page built into the API.</w:t>
+        <w:t>Grafana dashboard (status, totals, positive share, error rate, latency percentiles, request rate, predictions per label, risk distribution) and a dependency-free /monitor page built into the API (screenshot in screenshots/11_api_monitor_dashboard.png).</w:t>
       </w:r>
     </w:p>
     <w:p>
@@ -4159,8 +4068,8 @@
       <w:r>
         <w:drawing>
           <wp:inline xmlns:a="http://schemas.openxmlformats.org/drawingml/2006/main" xmlns:pic="http://schemas.openxmlformats.org/drawingml/2006/picture">
-            <wp:extent cx="4860000" cy="2786400"/>
-            <wp:docPr id="20" name="Picture 20"/>
+            <wp:extent cx="5400000" cy="2700000"/>
+            <wp:docPr id="22" name="Picture 22"/>
             <wp:cNvGraphicFramePr>
               <a:graphicFrameLocks noChangeAspect="1"/>
             </wp:cNvGraphicFramePr>
@@ -4168,11 +4077,11 @@
               <a:graphicData uri="http://schemas.openxmlformats.org/drawingml/2006/picture">
                 <pic:pic>
                   <pic:nvPicPr>
-                    <pic:cNvPr id="0" name="11_api_monitor_dashboard.png"/>
+                    <pic:cNvPr id="0" name="18_grafana_dashboard.png"/>
                     <pic:cNvPicPr/>
                   </pic:nvPicPr>
                   <pic:blipFill>
-                    <a:blip r:embed="rId28"/>
+                    <a:blip r:embed="rId30"/>
                     <a:stretch>
                       <a:fillRect/>
                     </a:stretch>
@@ -4180,7 +4089,7 @@
                   <pic:spPr>
                     <a:xfrm>
                       <a:off x="0" y="0"/>
-                      <a:ext cx="4860000" cy="2786400"/>
+                      <a:ext cx="5400000" cy="2700000"/>
                     </a:xfrm>
                     <a:prstGeom prst="rect"/>
                   </pic:spPr>
@@ -4201,7 +4110,7 @@
           <w:color w:val="556670"/>
           <w:sz w:val="18"/>
         </w:rPr>
-        <w:t>Figure 17 - Built-in /monitor dashboard after 300 requests from scripts/load_test.py (5 % deliberately invalid).</w:t>
+        <w:t>Figure 18 - Grafana dashboard in the cluster after ~3,200 predictions through the LoadBalancer: 0 % 5xx, p95 latency ~50 ms, positive share 46 % (matches training prevalence). The early latency spike is the load burst before the HPA added replicas.</w:t>
       </w:r>
     </w:p>
     <w:p>
@@ -4211,8 +4120,8 @@
       <w:r>
         <w:drawing>
           <wp:inline xmlns:a="http://schemas.openxmlformats.org/drawingml/2006/main" xmlns:pic="http://schemas.openxmlformats.org/drawingml/2006/picture">
-            <wp:extent cx="5040000" cy="1881600"/>
-            <wp:docPr id="21" name="Picture 21"/>
+            <wp:extent cx="3960000" cy="2112000"/>
+            <wp:docPr id="23" name="Picture 23"/>
             <wp:cNvGraphicFramePr>
               <a:graphicFrameLocks noChangeAspect="1"/>
             </wp:cNvGraphicFramePr>
@@ -4220,11 +4129,11 @@
               <a:graphicData uri="http://schemas.openxmlformats.org/drawingml/2006/picture">
                 <pic:pic>
                   <pic:nvPicPr>
-                    <pic:cNvPr id="0" name="12_api_json_logs.png"/>
+                    <pic:cNvPr id="0" name="19_prometheus_targets.png"/>
                     <pic:cNvPicPr/>
                   </pic:nvPicPr>
                   <pic:blipFill>
-                    <a:blip r:embed="rId29"/>
+                    <a:blip r:embed="rId31"/>
                     <a:stretch>
                       <a:fillRect/>
                     </a:stretch>
@@ -4232,7 +4141,7 @@
                   <pic:spPr>
                     <a:xfrm>
                       <a:off x="0" y="0"/>
-                      <a:ext cx="5040000" cy="1881600"/>
+                      <a:ext cx="3960000" cy="2112000"/>
                     </a:xfrm>
                     <a:prstGeom prst="rect"/>
                   </pic:spPr>
@@ -4253,75 +4162,7 @@
           <w:color w:val="556670"/>
           <w:sz w:val="18"/>
         </w:rPr>
-        <w:t>Figure 18 - Structured JSON request and prediction logs.</w:t>
-      </w:r>
-    </w:p>
-    <w:tbl>
-      <w:tblPr>
-        <w:tblW w:type="auto" w:w="0"/>
-        <w:jc w:val="center"/>
-        <w:tblLook w:firstColumn="1" w:firstRow="1" w:lastColumn="0" w:lastRow="0" w:noHBand="0" w:noVBand="1" w:val="04A0"/>
-      </w:tblPr>
-      <w:tblGrid>
-        <w:gridCol w:w="4876"/>
-        <w:gridCol w:w="4876"/>
-      </w:tblGrid>
-      <w:tr>
-        <w:tc>
-          <w:tcPr>
-            <w:tcW w:type="dxa" w:w="4762"/>
-          </w:tcPr>
-          <w:p>
-            <w:pPr>
-              <w:jc w:val="center"/>
-            </w:pPr>
-            <w:r>
-              <w:rPr>
-                <w:b/>
-                <w:color w:val="C0392B"/>
-              </w:rPr>
-              <w:br/>
-              <w:t>[ Insert screenshot:</w:t>
-              <w:br/>
-              <w:t>screenshots/18_grafana_dashboard.png ]</w:t>
-              <w:br/>
-            </w:r>
-          </w:p>
-        </w:tc>
-        <w:tc>
-          <w:tcPr>
-            <w:tcW w:type="dxa" w:w="4762"/>
-          </w:tcPr>
-          <w:p>
-            <w:pPr>
-              <w:jc w:val="center"/>
-            </w:pPr>
-            <w:r>
-              <w:rPr>
-                <w:b/>
-                <w:color w:val="C0392B"/>
-              </w:rPr>
-              <w:br/>
-              <w:t>[ Insert screenshot:</w:t>
-              <w:br/>
-              <w:t>screenshots/19_prometheus_targets.png ]</w:t>
-              <w:br/>
-            </w:r>
-          </w:p>
-        </w:tc>
-      </w:tr>
-    </w:tbl>
-    <w:p>
-      <w:pPr>
-        <w:jc w:val="center"/>
-      </w:pPr>
-      <w:r>
-        <w:rPr>
-          <w:i/>
-          <w:color w:val="556670"/>
-          <w:sz w:val="18"/>
-        </w:rPr>
-        <w:t>Figure 19 - Grafana dashboard fed by Prometheus (left) and Prometheus scraping every API pod (right).</w:t>
+        <w:t>Figure 19 - Prometheus pod discovery: all 4 API replicas UP.</w:t>
       </w:r>
     </w:p>
     <w:p>

</xml_diff>

<commit_message>
CI: Node 24 action versions and pinned runner; README badge; 10-page report
Co-Authored-By: Claude Opus 5.5 <noreply@anthropic.com>
</commit_message>
<xml_diff>
--- a/reports/MLOps_Assignment1_Report.docx
+++ b/reports/MLOps_Assignment1_Report.docx
@@ -2,11 +2,6 @@
 <file path=word/document.xml><?xml version="1.0" encoding="utf-8"?>
 <w:document xmlns:wpc="http://schemas.microsoft.com/office/word/2010/wordprocessingCanvas" xmlns:mo="http://schemas.microsoft.com/office/mac/office/2008/main" xmlns:mc="http://schemas.openxmlformats.org/markup-compatibility/2006" xmlns:mv="urn:schemas-microsoft-com:mac:vml" xmlns:o="urn:schemas-microsoft-com:office:office" xmlns:r="http://schemas.openxmlformats.org/officeDocument/2006/relationships" xmlns:m="http://schemas.openxmlformats.org/officeDocument/2006/math" xmlns:v="urn:schemas-microsoft-com:vml" xmlns:wp14="http://schemas.microsoft.com/office/word/2010/wordprocessingDrawing" xmlns:wp="http://schemas.openxmlformats.org/drawingml/2006/wordprocessingDrawing" xmlns:w10="urn:schemas-microsoft-com:office:word" xmlns:w="http://schemas.openxmlformats.org/wordprocessingml/2006/main" xmlns:w14="http://schemas.microsoft.com/office/word/2010/wordml" xmlns:wpg="http://schemas.microsoft.com/office/word/2010/wordprocessingGroup" xmlns:wpi="http://schemas.microsoft.com/office/word/2010/wordprocessingInk" xmlns:wne="http://schemas.microsoft.com/office/word/2006/wordml" xmlns:wps="http://schemas.microsoft.com/office/word/2010/wordprocessingShape" mc:Ignorable="w14 wp14">
   <w:body>
-    <w:p/>
-    <w:p/>
-    <w:p/>
-    <w:p/>
-    <w:p/>
     <w:p>
       <w:pPr>
         <w:jc w:val="center"/>
@@ -14,24 +9,11 @@
       <w:r>
         <w:rPr>
           <w:i w:val="0"/>
-          <w:sz w:val="26"/>
+          <w:sz w:val="22"/>
         </w:rPr>
-        <w:t>Machine Learning Operations (AIMLCZG523)</w:t>
+        <w:t>Machine Learning Operations (AIMLCZG523)  |  Assignment 01</w:t>
       </w:r>
     </w:p>
-    <w:p>
-      <w:pPr>
-        <w:jc w:val="center"/>
-      </w:pPr>
-      <w:r>
-        <w:rPr>
-          <w:i w:val="0"/>
-          <w:sz w:val="26"/>
-        </w:rPr>
-        <w:t>Assignment 01</w:t>
-      </w:r>
-    </w:p>
-    <w:p/>
     <w:p>
       <w:pPr>
         <w:jc w:val="center"/>
@@ -41,42 +23,9 @@
           <w:b/>
           <w:i w:val="0"/>
           <w:color w:val="1F6F8B"/>
-          <w:sz w:val="44"/>
+          <w:sz w:val="36"/>
         </w:rPr>
-        <w:t>Heart Disease Risk Prediction:</w:t>
-        <w:br/>
-        <w:t>an End-to-End MLOps Pipeline</w:t>
-      </w:r>
-    </w:p>
-    <w:p/>
-    <w:p>
-      <w:pPr>
-        <w:jc w:val="center"/>
-      </w:pPr>
-      <w:r>
-        <w:rPr>
-          <w:i/>
-          <w:sz w:val="22"/>
-        </w:rPr>
-        <w:t>Data acquisition · EDA · model development · MLflow tracking · packaging · CI/CD · Docker · Kubernetes · monitoring</w:t>
-      </w:r>
-    </w:p>
-    <w:p/>
-    <w:p/>
-    <w:p/>
-    <w:p/>
-    <w:p/>
-    <w:p/>
-    <w:p>
-      <w:pPr>
-        <w:jc w:val="center"/>
-      </w:pPr>
-      <w:r>
-        <w:rPr>
-          <w:i w:val="0"/>
-          <w:sz w:val="24"/>
-        </w:rPr>
-        <w:t>Altaf Anwar Pinjari  |  2025AE05638</w:t>
+        <w:t>Heart Disease Risk Prediction: an End-to-End MLOps Pipeline</w:t>
       </w:r>
     </w:p>
     <w:p>
@@ -88,6 +37,21 @@
           <w:i w:val="0"/>
           <w:sz w:val="22"/>
         </w:rPr>
+        <w:t>Altaf Anwar Pinjari  |  2025AE05638</w:t>
+      </w:r>
+    </w:p>
+    <w:p>
+      <w:pPr>
+        <w:jc w:val="center"/>
+        <w:pBdr>
+          <w:bottom w:val="single" w:sz="8" w:space="4" w:color="1F6F8B"/>
+        </w:pBdr>
+      </w:pPr>
+      <w:r>
+        <w:rPr>
+          <w:i w:val="0"/>
+          <w:sz w:val="20"/>
+        </w:rPr>
         <w:t xml:space="preserve">Code repository: </w:t>
       </w:r>
       <w:r>
@@ -95,11 +59,6 @@
           <w:color w:val="1F6F8B"/>
         </w:rPr>
         <w:t>https://github.com/altafpinjari2001/heart-disease-mlops</w:t>
-      </w:r>
-    </w:p>
-    <w:p>
-      <w:r>
-        <w:br w:type="page"/>
       </w:r>
     </w:p>
     <w:p>
@@ -392,7 +351,7 @@
       <w:r>
         <w:drawing>
           <wp:inline xmlns:a="http://schemas.openxmlformats.org/drawingml/2006/main" xmlns:pic="http://schemas.openxmlformats.org/drawingml/2006/picture">
-            <wp:extent cx="5903999" cy="4198399"/>
+            <wp:extent cx="5040000" cy="3584000"/>
             <wp:docPr id="1" name="Picture 1"/>
             <wp:cNvGraphicFramePr>
               <a:graphicFrameLocks noChangeAspect="1"/>
@@ -413,7 +372,7 @@
                   <pic:spPr>
                     <a:xfrm>
                       <a:off x="0" y="0"/>
-                      <a:ext cx="5903999" cy="4198399"/>
+                      <a:ext cx="5040000" cy="3584000"/>
                     </a:xfrm>
                     <a:prstGeom prst="rect"/>
                   </pic:spPr>
@@ -1182,7 +1141,7 @@
       <w:r>
         <w:drawing>
           <wp:inline xmlns:a="http://schemas.openxmlformats.org/drawingml/2006/main" xmlns:pic="http://schemas.openxmlformats.org/drawingml/2006/picture">
-            <wp:extent cx="4860000" cy="2632500"/>
+            <wp:extent cx="4320000" cy="2340000"/>
             <wp:docPr id="4" name="Picture 4"/>
             <wp:cNvGraphicFramePr>
               <a:graphicFrameLocks noChangeAspect="1"/>
@@ -1203,7 +1162,7 @@
                   <pic:spPr>
                     <a:xfrm>
                       <a:off x="0" y="0"/>
-                      <a:ext cx="4860000" cy="2632500"/>
+                      <a:ext cx="4320000" cy="2340000"/>
                     </a:xfrm>
                     <a:prstGeom prst="rect"/>
                   </pic:spPr>
@@ -1372,7 +1331,7 @@
       <w:r>
         <w:drawing>
           <wp:inline xmlns:a="http://schemas.openxmlformats.org/drawingml/2006/main" xmlns:pic="http://schemas.openxmlformats.org/drawingml/2006/picture">
-            <wp:extent cx="5220000" cy="2423571"/>
+            <wp:extent cx="4680000" cy="2172857"/>
             <wp:docPr id="7" name="Picture 7"/>
             <wp:cNvGraphicFramePr>
               <a:graphicFrameLocks noChangeAspect="1"/>
@@ -1393,7 +1352,7 @@
                   <pic:spPr>
                     <a:xfrm>
                       <a:off x="0" y="0"/>
-                      <a:ext cx="5220000" cy="2423571"/>
+                      <a:ext cx="4680000" cy="2172857"/>
                     </a:xfrm>
                     <a:prstGeom prst="rect"/>
                   </pic:spPr>
@@ -2630,7 +2589,7 @@
       <w:r>
         <w:drawing>
           <wp:inline xmlns:a="http://schemas.openxmlformats.org/drawingml/2006/main" xmlns:pic="http://schemas.openxmlformats.org/drawingml/2006/picture">
-            <wp:extent cx="5220000" cy="1898182"/>
+            <wp:extent cx="4680000" cy="1701818"/>
             <wp:docPr id="13" name="Picture 13"/>
             <wp:cNvGraphicFramePr>
               <a:graphicFrameLocks noChangeAspect="1"/>
@@ -2651,7 +2610,7 @@
                   <pic:spPr>
                     <a:xfrm>
                       <a:off x="0" y="0"/>
-                      <a:ext cx="5220000" cy="1898182"/>
+                      <a:ext cx="4680000" cy="1701818"/>
                     </a:xfrm>
                     <a:prstGeom prst="rect"/>
                   </pic:spPr>
@@ -2681,58 +2640,6 @@
           <w:i w:val="0"/>
         </w:rPr>
         <w:t>The tracking data also explains the tuning behaviour: strong L1 regularisation (C &lt;= 0.03) removes every coefficient (AUC 0.5), and logistic regression plateaus at ~0.90-0.91 from C = 0.1. Random-forest configurations are tightly clustered (0.87-0.90), while gradient boosting with deeper trees overfits.</w:t>
-      </w:r>
-    </w:p>
-    <w:p>
-      <w:pPr>
-        <w:jc w:val="center"/>
-      </w:pPr>
-      <w:r>
-        <w:drawing>
-          <wp:inline xmlns:a="http://schemas.openxmlformats.org/drawingml/2006/main" xmlns:pic="http://schemas.openxmlformats.org/drawingml/2006/picture">
-            <wp:extent cx="3600000" cy="2025000"/>
-            <wp:docPr id="14" name="Picture 14"/>
-            <wp:cNvGraphicFramePr>
-              <a:graphicFrameLocks noChangeAspect="1"/>
-            </wp:cNvGraphicFramePr>
-            <a:graphic>
-              <a:graphicData uri="http://schemas.openxmlformats.org/drawingml/2006/picture">
-                <pic:pic>
-                  <pic:nvPicPr>
-                    <pic:cNvPr id="0" name="05_mlflow_artifacts_roc.png"/>
-                    <pic:cNvPicPr/>
-                  </pic:nvPicPr>
-                  <pic:blipFill>
-                    <a:blip r:embed="rId22"/>
-                    <a:stretch>
-                      <a:fillRect/>
-                    </a:stretch>
-                  </pic:blipFill>
-                  <pic:spPr>
-                    <a:xfrm>
-                      <a:off x="0" y="0"/>
-                      <a:ext cx="3600000" cy="2025000"/>
-                    </a:xfrm>
-                    <a:prstGeom prst="rect"/>
-                  </pic:spPr>
-                </pic:pic>
-              </a:graphicData>
-            </a:graphic>
-          </wp:inline>
-        </w:drawing>
-      </w:r>
-    </w:p>
-    <w:p>
-      <w:pPr>
-        <w:jc w:val="center"/>
-      </w:pPr>
-      <w:r>
-        <w:rPr>
-          <w:i/>
-          <w:color w:val="556670"/>
-          <w:sz w:val="18"/>
-        </w:rPr>
-        <w:t>Figure 10 - Logged artefacts of a run (plots, cv results, model).</w:t>
       </w:r>
     </w:p>
     <w:p>
@@ -2997,8 +2904,8 @@
       <w:r>
         <w:drawing>
           <wp:inline xmlns:a="http://schemas.openxmlformats.org/drawingml/2006/main" xmlns:pic="http://schemas.openxmlformats.org/drawingml/2006/picture">
-            <wp:extent cx="3780000" cy="3634615"/>
-            <wp:docPr id="15" name="Picture 15"/>
+            <wp:extent cx="3060000" cy="2942308"/>
+            <wp:docPr id="14" name="Picture 14"/>
             <wp:cNvGraphicFramePr>
               <a:graphicFrameLocks noChangeAspect="1"/>
             </wp:cNvGraphicFramePr>
@@ -3010,7 +2917,7 @@
                     <pic:cNvPicPr/>
                   </pic:nvPicPr>
                   <pic:blipFill>
-                    <a:blip r:embed="rId23"/>
+                    <a:blip r:embed="rId22"/>
                     <a:stretch>
                       <a:fillRect/>
                     </a:stretch>
@@ -3018,7 +2925,7 @@
                   <pic:spPr>
                     <a:xfrm>
                       <a:off x="0" y="0"/>
-                      <a:ext cx="3780000" cy="3634615"/>
+                      <a:ext cx="3060000" cy="2942308"/>
                     </a:xfrm>
                     <a:prstGeom prst="rect"/>
                   </pic:spPr>
@@ -3039,7 +2946,7 @@
           <w:color w:val="556670"/>
           <w:sz w:val="18"/>
         </w:rPr>
-        <w:t>Figure 11 -flake8 (0 issues) and 28 passing tests with coverage.</w:t>
+        <w:t>Figure 10 -flake8 (0 issues) and 28 passing tests with coverage.</w:t>
       </w:r>
     </w:p>
     <w:p>
@@ -3306,8 +3213,8 @@
       <w:r>
         <w:drawing>
           <wp:inline xmlns:a="http://schemas.openxmlformats.org/drawingml/2006/main" xmlns:pic="http://schemas.openxmlformats.org/drawingml/2006/picture">
-            <wp:extent cx="4140000" cy="3588000"/>
-            <wp:docPr id="16" name="Picture 16"/>
+            <wp:extent cx="3600000" cy="3120000"/>
+            <wp:docPr id="15" name="Picture 15"/>
             <wp:cNvGraphicFramePr>
               <a:graphicFrameLocks noChangeAspect="1"/>
             </wp:cNvGraphicFramePr>
@@ -3319,7 +3226,7 @@
                     <pic:cNvPicPr/>
                   </pic:nvPicPr>
                   <pic:blipFill>
-                    <a:blip r:embed="rId24"/>
+                    <a:blip r:embed="rId23"/>
                     <a:stretch>
                       <a:fillRect/>
                     </a:stretch>
@@ -3327,7 +3234,7 @@
                   <pic:spPr>
                     <a:xfrm>
                       <a:off x="0" y="0"/>
-                      <a:ext cx="4140000" cy="3588000"/>
+                      <a:ext cx="3600000" cy="3120000"/>
                     </a:xfrm>
                     <a:prstGeom prst="rect"/>
                   </pic:spPr>
@@ -3348,7 +3255,7 @@
           <w:color w:val="556670"/>
           <w:sz w:val="18"/>
         </w:rPr>
-        <w:t>Figure 12 - GitHub Actions run #1: all four jobs green, 6 artefacts.</w:t>
+        <w:t>Figure 11 - GitHub Actions run #1: all four jobs green, 6 artefacts.</w:t>
       </w:r>
     </w:p>
     <w:p>
@@ -3359,7 +3266,7 @@
         <w:drawing>
           <wp:inline xmlns:a="http://schemas.openxmlformats.org/drawingml/2006/main" xmlns:pic="http://schemas.openxmlformats.org/drawingml/2006/picture">
             <wp:extent cx="5040000" cy="2318400"/>
-            <wp:docPr id="17" name="Picture 17"/>
+            <wp:docPr id="16" name="Picture 16"/>
             <wp:cNvGraphicFramePr>
               <a:graphicFrameLocks noChangeAspect="1"/>
             </wp:cNvGraphicFramePr>
@@ -3371,7 +3278,7 @@
                     <pic:cNvPicPr/>
                   </pic:nvPicPr>
                   <pic:blipFill>
-                    <a:blip r:embed="rId25"/>
+                    <a:blip r:embed="rId24"/>
                     <a:stretch>
                       <a:fillRect/>
                     </a:stretch>
@@ -3400,7 +3307,7 @@
           <w:color w:val="556670"/>
           <w:sz w:val="18"/>
         </w:rPr>
-        <w:t>Figure 13 - CI Docker job log: image build, container start, /health and /predict smoke test, structured container logs.</w:t>
+        <w:t>Figure 12 - CI Docker job log: image build, container start, /health and /predict smoke test, structured container logs.</w:t>
       </w:r>
     </w:p>
     <w:p>
@@ -3458,7 +3365,7 @@
         <w:rPr>
           <w:i w:val="0"/>
         </w:rPr>
-        <w:t>The image was built and run locally with Docker Desktop 29.9 (final image 258 MB) and is also built and smoke-tested in every CI run (Figure 13).</w:t>
+        <w:t>The image was built and run locally with Docker Desktop 29.9 (final image 258 MB) and is also built and smoke-tested in every CI run (Figure 12).</w:t>
       </w:r>
     </w:p>
     <w:p>
@@ -3468,8 +3375,8 @@
       <w:r>
         <w:drawing>
           <wp:inline xmlns:a="http://schemas.openxmlformats.org/drawingml/2006/main" xmlns:pic="http://schemas.openxmlformats.org/drawingml/2006/picture">
-            <wp:extent cx="3780000" cy="3053077"/>
-            <wp:docPr id="18" name="Picture 18"/>
+            <wp:extent cx="2880000" cy="2326154"/>
+            <wp:docPr id="17" name="Picture 17"/>
             <wp:cNvGraphicFramePr>
               <a:graphicFrameLocks noChangeAspect="1"/>
             </wp:cNvGraphicFramePr>
@@ -3481,7 +3388,7 @@
                     <pic:cNvPicPr/>
                   </pic:nvPicPr>
                   <pic:blipFill>
-                    <a:blip r:embed="rId26"/>
+                    <a:blip r:embed="rId25"/>
                     <a:stretch>
                       <a:fillRect/>
                     </a:stretch>
@@ -3489,7 +3396,7 @@
                   <pic:spPr>
                     <a:xfrm>
                       <a:off x="0" y="0"/>
-                      <a:ext cx="3780000" cy="3053077"/>
+                      <a:ext cx="2880000" cy="2326154"/>
                     </a:xfrm>
                     <a:prstGeom prst="rect"/>
                   </pic:spPr>
@@ -3510,7 +3417,7 @@
           <w:color w:val="556670"/>
           <w:sz w:val="18"/>
         </w:rPr>
-        <w:t>Figure 14 - Local multi-stage docker build of heart-risk-api:1.0.0.</w:t>
+        <w:t>Figure 13 - Local multi-stage docker build of heart-risk-api:1.0.0.</w:t>
       </w:r>
     </w:p>
     <w:p>
@@ -3520,8 +3427,8 @@
       <w:r>
         <w:drawing>
           <wp:inline xmlns:a="http://schemas.openxmlformats.org/drawingml/2006/main" xmlns:pic="http://schemas.openxmlformats.org/drawingml/2006/picture">
-            <wp:extent cx="5400000" cy="1851429"/>
-            <wp:docPr id="19" name="Picture 19"/>
+            <wp:extent cx="4860000" cy="1666286"/>
+            <wp:docPr id="18" name="Picture 18"/>
             <wp:cNvGraphicFramePr>
               <a:graphicFrameLocks noChangeAspect="1"/>
             </wp:cNvGraphicFramePr>
@@ -3533,7 +3440,7 @@
                     <pic:cNvPicPr/>
                   </pic:nvPicPr>
                   <pic:blipFill>
-                    <a:blip r:embed="rId27"/>
+                    <a:blip r:embed="rId26"/>
                     <a:stretch>
                       <a:fillRect/>
                     </a:stretch>
@@ -3541,7 +3448,7 @@
                   <pic:spPr>
                     <a:xfrm>
                       <a:off x="0" y="0"/>
-                      <a:ext cx="5400000" cy="1851429"/>
+                      <a:ext cx="4860000" cy="1666286"/>
                     </a:xfrm>
                     <a:prstGeom prst="rect"/>
                   </pic:spPr>
@@ -3562,7 +3469,7 @@
           <w:color w:val="556670"/>
           <w:sz w:val="18"/>
         </w:rPr>
-        <w:t>Figure 15 - Container running (docker ps), /health and /predict answered from the container, JSON logs via docker logs.</w:t>
+        <w:t>Figure 14 - Container running (docker ps), /health and /predict answered from the container, JSON logs via docker logs.</w:t>
       </w:r>
     </w:p>
     <w:p>
@@ -3900,8 +3807,8 @@
       <w:r>
         <w:drawing>
           <wp:inline xmlns:a="http://schemas.openxmlformats.org/drawingml/2006/main" xmlns:pic="http://schemas.openxmlformats.org/drawingml/2006/picture">
-            <wp:extent cx="5040000" cy="3179077"/>
-            <wp:docPr id="20" name="Picture 20"/>
+            <wp:extent cx="4320000" cy="2724923"/>
+            <wp:docPr id="19" name="Picture 19"/>
             <wp:cNvGraphicFramePr>
               <a:graphicFrameLocks noChangeAspect="1"/>
             </wp:cNvGraphicFramePr>
@@ -3913,7 +3820,7 @@
                     <pic:cNvPicPr/>
                   </pic:nvPicPr>
                   <pic:blipFill>
-                    <a:blip r:embed="rId28"/>
+                    <a:blip r:embed="rId27"/>
                     <a:stretch>
                       <a:fillRect/>
                     </a:stretch>
@@ -3921,7 +3828,7 @@
                   <pic:spPr>
                     <a:xfrm>
                       <a:off x="0" y="0"/>
-                      <a:ext cx="5040000" cy="3179077"/>
+                      <a:ext cx="4320000" cy="2724923"/>
                     </a:xfrm>
                     <a:prstGeom prst="rect"/>
                   </pic:spPr>
@@ -3942,7 +3849,7 @@
           <w:color w:val="556670"/>
           <w:sz w:val="18"/>
         </w:rPr>
-        <w:t>Figure 16 - Node, Deployments, Pods, Services, Ingress and HPA (scaled 2 -&gt; 4 under load) in namespace heart-risk.</w:t>
+        <w:t>Figure 15 - Node, Deployments, Pods, Services, Ingress and HPA (scaled 2 -&gt; 4 under load) in namespace heart-risk.</w:t>
       </w:r>
     </w:p>
     <w:p>
@@ -3952,8 +3859,8 @@
       <w:r>
         <w:drawing>
           <wp:inline xmlns:a="http://schemas.openxmlformats.org/drawingml/2006/main" xmlns:pic="http://schemas.openxmlformats.org/drawingml/2006/picture">
-            <wp:extent cx="5400000" cy="2005714"/>
-            <wp:docPr id="21" name="Picture 21"/>
+            <wp:extent cx="4680000" cy="1738286"/>
+            <wp:docPr id="20" name="Picture 20"/>
             <wp:cNvGraphicFramePr>
               <a:graphicFrameLocks noChangeAspect="1"/>
             </wp:cNvGraphicFramePr>
@@ -3965,7 +3872,7 @@
                     <pic:cNvPicPr/>
                   </pic:nvPicPr>
                   <pic:blipFill>
-                    <a:blip r:embed="rId29"/>
+                    <a:blip r:embed="rId28"/>
                     <a:stretch>
                       <a:fillRect/>
                     </a:stretch>
@@ -3973,7 +3880,7 @@
                   <pic:spPr>
                     <a:xfrm>
                       <a:off x="0" y="0"/>
-                      <a:ext cx="5400000" cy="2005714"/>
+                      <a:ext cx="4680000" cy="1738286"/>
                     </a:xfrm>
                     <a:prstGeom prst="rect"/>
                   </pic:spPr>
@@ -3994,7 +3901,7 @@
           <w:color w:val="556670"/>
           <w:sz w:val="18"/>
         </w:rPr>
-        <w:t>Figure 17 - Predictions served through the LoadBalancer and the NGINX Ingress, plus pod logs.</w:t>
+        <w:t>Figure 16 - Predictions served through the LoadBalancer and the NGINX Ingress, plus pod logs.</w:t>
       </w:r>
     </w:p>
     <w:p>
@@ -4068,8 +3975,8 @@
       <w:r>
         <w:drawing>
           <wp:inline xmlns:a="http://schemas.openxmlformats.org/drawingml/2006/main" xmlns:pic="http://schemas.openxmlformats.org/drawingml/2006/picture">
-            <wp:extent cx="5400000" cy="2700000"/>
-            <wp:docPr id="22" name="Picture 22"/>
+            <wp:extent cx="5040000" cy="2520000"/>
+            <wp:docPr id="21" name="Picture 21"/>
             <wp:cNvGraphicFramePr>
               <a:graphicFrameLocks noChangeAspect="1"/>
             </wp:cNvGraphicFramePr>
@@ -4081,7 +3988,7 @@
                     <pic:cNvPicPr/>
                   </pic:nvPicPr>
                   <pic:blipFill>
-                    <a:blip r:embed="rId30"/>
+                    <a:blip r:embed="rId29"/>
                     <a:stretch>
                       <a:fillRect/>
                     </a:stretch>
@@ -4089,7 +3996,7 @@
                   <pic:spPr>
                     <a:xfrm>
                       <a:off x="0" y="0"/>
-                      <a:ext cx="5400000" cy="2700000"/>
+                      <a:ext cx="5040000" cy="2520000"/>
                     </a:xfrm>
                     <a:prstGeom prst="rect"/>
                   </pic:spPr>
@@ -4110,7 +4017,7 @@
           <w:color w:val="556670"/>
           <w:sz w:val="18"/>
         </w:rPr>
-        <w:t>Figure 18 - Grafana dashboard in the cluster after ~3,200 predictions through the LoadBalancer: 0 % 5xx, p95 latency ~50 ms, positive share 46 % (matches training prevalence). The early latency spike is the load burst before the HPA added replicas.</w:t>
+        <w:t>Figure 17 - Grafana dashboard in the cluster after ~3,200 predictions through the LoadBalancer: 0 % 5xx, p95 latency ~50 ms, positive share 46 % (matches training prevalence). The early latency spike is the load burst before the HPA added replicas.</w:t>
       </w:r>
     </w:p>
     <w:p>
@@ -4120,8 +4027,8 @@
       <w:r>
         <w:drawing>
           <wp:inline xmlns:a="http://schemas.openxmlformats.org/drawingml/2006/main" xmlns:pic="http://schemas.openxmlformats.org/drawingml/2006/picture">
-            <wp:extent cx="3960000" cy="2112000"/>
-            <wp:docPr id="23" name="Picture 23"/>
+            <wp:extent cx="3600000" cy="1920000"/>
+            <wp:docPr id="22" name="Picture 22"/>
             <wp:cNvGraphicFramePr>
               <a:graphicFrameLocks noChangeAspect="1"/>
             </wp:cNvGraphicFramePr>
@@ -4133,7 +4040,7 @@
                     <pic:cNvPicPr/>
                   </pic:nvPicPr>
                   <pic:blipFill>
-                    <a:blip r:embed="rId31"/>
+                    <a:blip r:embed="rId30"/>
                     <a:stretch>
                       <a:fillRect/>
                     </a:stretch>
@@ -4141,7 +4048,7 @@
                   <pic:spPr>
                     <a:xfrm>
                       <a:off x="0" y="0"/>
-                      <a:ext cx="3960000" cy="2112000"/>
+                      <a:ext cx="3600000" cy="1920000"/>
                     </a:xfrm>
                     <a:prstGeom prst="rect"/>
                   </pic:spPr>
@@ -4162,7 +4069,7 @@
           <w:color w:val="556670"/>
           <w:sz w:val="18"/>
         </w:rPr>
-        <w:t>Figure 19 - Prometheus pod discovery: all 4 API replicas UP.</w:t>
+        <w:t>Figure 18 - Prometheus pod discovery: all 4 API replicas UP.</w:t>
       </w:r>
     </w:p>
     <w:p>

</xml_diff>

<commit_message>
Report: clean CI run screenshot; video narration transcript
Co-Authored-By: Claude Opus 5.5 <noreply@anthropic.com>
</commit_message>
<xml_diff>
--- a/reports/MLOps_Assignment1_Report.docx
+++ b/reports/MLOps_Assignment1_Report.docx
@@ -3213,7 +3213,7 @@
       <w:r>
         <w:drawing>
           <wp:inline xmlns:a="http://schemas.openxmlformats.org/drawingml/2006/main" xmlns:pic="http://schemas.openxmlformats.org/drawingml/2006/picture">
-            <wp:extent cx="3600000" cy="3120000"/>
+            <wp:extent cx="3600000" cy="2000000"/>
             <wp:docPr id="15" name="Picture 15"/>
             <wp:cNvGraphicFramePr>
               <a:graphicFrameLocks noChangeAspect="1"/>
@@ -3234,7 +3234,7 @@
                   <pic:spPr>
                     <a:xfrm>
                       <a:off x="0" y="0"/>
-                      <a:ext cx="3600000" cy="3120000"/>
+                      <a:ext cx="3600000" cy="2000000"/>
                     </a:xfrm>
                     <a:prstGeom prst="rect"/>
                   </pic:spPr>
@@ -3255,7 +3255,7 @@
           <w:color w:val="556670"/>
           <w:sz w:val="18"/>
         </w:rPr>
-        <w:t>Figure 11 - GitHub Actions run #1: all four jobs green, 6 artefacts.</w:t>
+        <w:t>Figure 11 - GitHub Actions run #6: lint, tests, training and Docker jobs all green, 6 artefacts, no warnings.</w:t>
       </w:r>
     </w:p>
     <w:p>

</xml_diff>

<commit_message>
Report and README: link to the demo video
Co-Authored-By: Claude Opus 5.5 <noreply@anthropic.com>
</commit_message>
<xml_diff>
--- a/reports/MLOps_Assignment1_Report.docx
+++ b/reports/MLOps_Assignment1_Report.docx
@@ -42,6 +42,29 @@
     </w:p>
     <w:p>
       <w:pPr>
+        <w:spacing w:after="0"/>
+        <w:jc w:val="center"/>
+      </w:pPr>
+      <w:r>
+        <w:rPr>
+          <w:i w:val="0"/>
+          <w:sz w:val="20"/>
+        </w:rPr>
+        <w:t xml:space="preserve">Code repository: </w:t>
+      </w:r>
+      <w:hyperlink r:id="rId9">
+        <w:r>
+          <w:rPr>
+            <w:color w:val="1F6F8B"/>
+            <w:u w:val="single"/>
+            <w:sz w:val="20"/>
+          </w:rPr>
+          <w:t>https://github.com/altafpinjari2001/heart-disease-mlops</w:t>
+        </w:r>
+      </w:hyperlink>
+    </w:p>
+    <w:p>
+      <w:pPr>
         <w:jc w:val="center"/>
         <w:pBdr>
           <w:bottom w:val="single" w:sz="8" w:space="4" w:color="1F6F8B"/>
@@ -52,14 +75,18 @@
           <w:i w:val="0"/>
           <w:sz w:val="20"/>
         </w:rPr>
-        <w:t xml:space="preserve">Code repository: </w:t>
+        <w:t xml:space="preserve">Demo video: </w:t>
       </w:r>
-      <w:r>
-        <w:rPr>
-          <w:color w:val="1F6F8B"/>
-        </w:rPr>
-        <w:t>https://github.com/altafpinjari2001/heart-disease-mlops</w:t>
-      </w:r>
+      <w:hyperlink r:id="rId10">
+        <w:r>
+          <w:rPr>
+            <w:color w:val="1F6F8B"/>
+            <w:u w:val="single"/>
+            <w:sz w:val="20"/>
+          </w:rPr>
+          <w:t>https://drive.google.com/file/d/1N9qXK5QjRM7D30F2cs8cYlieP3KHAZhm/view?usp=sharing</w:t>
+        </w:r>
+      </w:hyperlink>
     </w:p>
     <w:p>
       <w:pPr>
@@ -364,7 +391,7 @@
                     <pic:cNvPicPr/>
                   </pic:nvPicPr>
                   <pic:blipFill>
-                    <a:blip r:embed="rId9"/>
+                    <a:blip r:embed="rId11"/>
                     <a:stretch>
                       <a:fillRect/>
                     </a:stretch>
@@ -1047,7 +1074,7 @@
                           <pic:cNvPicPr/>
                         </pic:nvPicPr>
                         <pic:blipFill>
-                          <a:blip r:embed="rId10"/>
+                          <a:blip r:embed="rId12"/>
                           <a:stretch>
                             <a:fillRect/>
                           </a:stretch>
@@ -1091,7 +1118,7 @@
                           <pic:cNvPicPr/>
                         </pic:nvPicPr>
                         <pic:blipFill>
-                          <a:blip r:embed="rId11"/>
+                          <a:blip r:embed="rId13"/>
                           <a:stretch>
                             <a:fillRect/>
                           </a:stretch>
@@ -1154,7 +1181,7 @@
                     <pic:cNvPicPr/>
                   </pic:nvPicPr>
                   <pic:blipFill>
-                    <a:blip r:embed="rId12"/>
+                    <a:blip r:embed="rId14"/>
                     <a:stretch>
                       <a:fillRect/>
                     </a:stretch>
@@ -1245,7 +1272,7 @@
                           <pic:cNvPicPr/>
                         </pic:nvPicPr>
                         <pic:blipFill>
-                          <a:blip r:embed="rId13"/>
+                          <a:blip r:embed="rId15"/>
                           <a:stretch>
                             <a:fillRect/>
                           </a:stretch>
@@ -1289,7 +1316,7 @@
                           <pic:cNvPicPr/>
                         </pic:nvPicPr>
                         <pic:blipFill>
-                          <a:blip r:embed="rId14"/>
+                          <a:blip r:embed="rId16"/>
                           <a:stretch>
                             <a:fillRect/>
                           </a:stretch>
@@ -1344,7 +1371,7 @@
                     <pic:cNvPicPr/>
                   </pic:nvPicPr>
                   <pic:blipFill>
-                    <a:blip r:embed="rId15"/>
+                    <a:blip r:embed="rId17"/>
                     <a:stretch>
                       <a:fillRect/>
                     </a:stretch>
@@ -2256,7 +2283,7 @@
                     <pic:cNvPicPr/>
                   </pic:nvPicPr>
                   <pic:blipFill>
-                    <a:blip r:embed="rId16"/>
+                    <a:blip r:embed="rId18"/>
                     <a:stretch>
                       <a:fillRect/>
                     </a:stretch>
@@ -2331,7 +2358,7 @@
                           <pic:cNvPicPr/>
                         </pic:nvPicPr>
                         <pic:blipFill>
-                          <a:blip r:embed="rId17"/>
+                          <a:blip r:embed="rId19"/>
                           <a:stretch>
                             <a:fillRect/>
                           </a:stretch>
@@ -2375,7 +2402,7 @@
                           <pic:cNvPicPr/>
                         </pic:nvPicPr>
                         <pic:blipFill>
-                          <a:blip r:embed="rId18"/>
+                          <a:blip r:embed="rId20"/>
                           <a:stretch>
                             <a:fillRect/>
                           </a:stretch>
@@ -2503,7 +2530,7 @@
                           <pic:cNvPicPr/>
                         </pic:nvPicPr>
                         <pic:blipFill>
-                          <a:blip r:embed="rId19"/>
+                          <a:blip r:embed="rId21"/>
                           <a:stretch>
                             <a:fillRect/>
                           </a:stretch>
@@ -2547,7 +2574,7 @@
                           <pic:cNvPicPr/>
                         </pic:nvPicPr>
                         <pic:blipFill>
-                          <a:blip r:embed="rId20"/>
+                          <a:blip r:embed="rId22"/>
                           <a:stretch>
                             <a:fillRect/>
                           </a:stretch>
@@ -2602,7 +2629,7 @@
                     <pic:cNvPicPr/>
                   </pic:nvPicPr>
                   <pic:blipFill>
-                    <a:blip r:embed="rId21"/>
+                    <a:blip r:embed="rId23"/>
                     <a:stretch>
                       <a:fillRect/>
                     </a:stretch>
@@ -2917,7 +2944,7 @@
                     <pic:cNvPicPr/>
                   </pic:nvPicPr>
                   <pic:blipFill>
-                    <a:blip r:embed="rId22"/>
+                    <a:blip r:embed="rId24"/>
                     <a:stretch>
                       <a:fillRect/>
                     </a:stretch>
@@ -3226,7 +3253,7 @@
                     <pic:cNvPicPr/>
                   </pic:nvPicPr>
                   <pic:blipFill>
-                    <a:blip r:embed="rId23"/>
+                    <a:blip r:embed="rId25"/>
                     <a:stretch>
                       <a:fillRect/>
                     </a:stretch>
@@ -3278,7 +3305,7 @@
                     <pic:cNvPicPr/>
                   </pic:nvPicPr>
                   <pic:blipFill>
-                    <a:blip r:embed="rId24"/>
+                    <a:blip r:embed="rId26"/>
                     <a:stretch>
                       <a:fillRect/>
                     </a:stretch>
@@ -3388,7 +3415,7 @@
                     <pic:cNvPicPr/>
                   </pic:nvPicPr>
                   <pic:blipFill>
-                    <a:blip r:embed="rId25"/>
+                    <a:blip r:embed="rId27"/>
                     <a:stretch>
                       <a:fillRect/>
                     </a:stretch>
@@ -3440,7 +3467,7 @@
                     <pic:cNvPicPr/>
                   </pic:nvPicPr>
                   <pic:blipFill>
-                    <a:blip r:embed="rId26"/>
+                    <a:blip r:embed="rId28"/>
                     <a:stretch>
                       <a:fillRect/>
                     </a:stretch>
@@ -3820,7 +3847,7 @@
                     <pic:cNvPicPr/>
                   </pic:nvPicPr>
                   <pic:blipFill>
-                    <a:blip r:embed="rId27"/>
+                    <a:blip r:embed="rId29"/>
                     <a:stretch>
                       <a:fillRect/>
                     </a:stretch>
@@ -3872,7 +3899,7 @@
                     <pic:cNvPicPr/>
                   </pic:nvPicPr>
                   <pic:blipFill>
-                    <a:blip r:embed="rId28"/>
+                    <a:blip r:embed="rId30"/>
                     <a:stretch>
                       <a:fillRect/>
                     </a:stretch>
@@ -3988,7 +4015,7 @@
                     <pic:cNvPicPr/>
                   </pic:nvPicPr>
                   <pic:blipFill>
-                    <a:blip r:embed="rId29"/>
+                    <a:blip r:embed="rId31"/>
                     <a:stretch>
                       <a:fillRect/>
                     </a:stretch>
@@ -4040,7 +4067,7 @@
                     <pic:cNvPicPr/>
                   </pic:nvPicPr>
                   <pic:blipFill>
-                    <a:blip r:embed="rId30"/>
+                    <a:blip r:embed="rId32"/>
                     <a:stretch>
                       <a:fillRect/>
                     </a:stretch>
@@ -4095,12 +4122,34 @@
         </w:rPr>
         <w:t xml:space="preserve">Code repository: </w:t>
       </w:r>
+      <w:hyperlink r:id="rId9">
+        <w:r>
+          <w:rPr>
+            <w:color w:val="1F6F8B"/>
+            <w:u w:val="single"/>
+            <w:b/>
+          </w:rPr>
+          <w:t>https://github.com/altafpinjari2001/heart-disease-mlops</w:t>
+        </w:r>
+      </w:hyperlink>
+    </w:p>
+    <w:p>
       <w:r>
         <w:rPr>
-          <w:b/>
+          <w:i w:val="0"/>
         </w:rPr>
-        <w:t>https://github.com/altafpinjari2001/heart-disease-mlops</w:t>
+        <w:t xml:space="preserve">Demo video (pipeline walkthrough): </w:t>
       </w:r>
+      <w:hyperlink r:id="rId10">
+        <w:r>
+          <w:rPr>
+            <w:color w:val="1F6F8B"/>
+            <w:u w:val="single"/>
+            <w:b/>
+          </w:rPr>
+          <w:t>https://drive.google.com/file/d/1N9qXK5QjRM7D30F2cs8cYlieP3KHAZhm/view?usp=sharing</w:t>
+        </w:r>
+      </w:hyperlink>
     </w:p>
     <w:sectPr>
       <w:pgSz w:w="11906" w:h="16838"/>

</xml_diff>